<commit_message>
Add AI declaration and register updates
</commit_message>
<xml_diff>
--- a/docs/declarations/templates/AI DECLARATION.docx
+++ b/docs/declarations/templates/AI DECLARATION.docx
@@ -64,14 +64,13 @@
           <w:placeholder>
             <w:docPart w:val="DefaultPlaceholder_-1854013440"/>
           </w:placeholder>
-          <w:showingPlcHdr/>
         </w:sdtPr>
         <w:sdtContent>
           <w:r>
-            <w:rPr>
-              <w:rStyle w:val="PlaceholderText"/>
-            </w:rPr>
-            <w:t>Click or tap here to enter text.</w:t>
+            <w:t>docs/</w:t>
+          </w:r>
+          <w:r>
+            <w:t>stakeholder-analysis</w:t>
           </w:r>
         </w:sdtContent>
       </w:sdt>
@@ -96,14 +95,10 @@
           <w:placeholder>
             <w:docPart w:val="DefaultPlaceholder_-1854013440"/>
           </w:placeholder>
-          <w:showingPlcHdr/>
         </w:sdtPr>
         <w:sdtContent>
           <w:r>
-            <w:rPr>
-              <w:rStyle w:val="PlaceholderText"/>
-            </w:rPr>
-            <w:t>Click or tap here to enter text.</w:t>
+            <w:t>Karabo Masoka</w:t>
           </w:r>
         </w:sdtContent>
       </w:sdt>
@@ -128,14 +123,10 @@
           <w:placeholder>
             <w:docPart w:val="DefaultPlaceholder_-1854013440"/>
           </w:placeholder>
-          <w:showingPlcHdr/>
         </w:sdtPr>
         <w:sdtContent>
           <w:r>
-            <w:rPr>
-              <w:rStyle w:val="PlaceholderText"/>
-            </w:rPr>
-            <w:t>Click or tap here to enter text.</w:t>
+            <w:t>601644</w:t>
           </w:r>
         </w:sdtContent>
       </w:sdt>
@@ -182,14 +173,14 @@
           <w:placeholder>
             <w:docPart w:val="DefaultPlaceholder_-1854013440"/>
           </w:placeholder>
-          <w:showingPlcHdr/>
         </w:sdtPr>
         <w:sdtContent>
           <w:r>
             <w:rPr>
-              <w:rStyle w:val="PlaceholderText"/>
+              <w:b/>
+              <w:bCs/>
             </w:rPr>
-            <w:t>Click or tap here to enter text.</w:t>
+            <w:t>02</w:t>
           </w:r>
         </w:sdtContent>
       </w:sdt>
@@ -249,14 +240,10 @@
           <w:placeholder>
             <w:docPart w:val="DefaultPlaceholder_-1854013440"/>
           </w:placeholder>
-          <w:showingPlcHdr/>
         </w:sdtPr>
         <w:sdtContent>
           <w:r>
-            <w:rPr>
-              <w:rStyle w:val="PlaceholderText"/>
-            </w:rPr>
-            <w:t>Click or tap here to enter text.</w:t>
+            <w:t>Karabo Masoka</w:t>
           </w:r>
         </w:sdtContent>
       </w:sdt>
@@ -281,8 +268,7 @@
           <w:placeholder>
             <w:docPart w:val="DefaultPlaceholder_-1854013437"/>
           </w:placeholder>
-          <w:showingPlcHdr/>
-          <w:date>
+          <w:date w:fullDate="2026-09-09T00:00:00Z">
             <w:dateFormat w:val="yyyy/MM/dd"/>
             <w:lid w:val="en-ZA"/>
             <w:storeMappedDataAs w:val="dateTime"/>
@@ -291,10 +277,7 @@
         </w:sdtPr>
         <w:sdtContent>
           <w:r>
-            <w:rPr>
-              <w:rStyle w:val="PlaceholderText"/>
-            </w:rPr>
-            <w:t>Click or tap to enter a date.</w:t>
+            <w:t>2026/09/09</w:t>
           </w:r>
         </w:sdtContent>
       </w:sdt>
@@ -945,6 +928,7 @@
   <w:style w:type="character" w:default="1" w:styleId="DefaultParagraphFont">
     <w:name w:val="Default Paragraph Font"/>
     <w:uiPriority w:val="1"/>
+    <w:semiHidden/>
     <w:unhideWhenUsed/>
   </w:style>
   <w:style w:type="table" w:default="1" w:styleId="TableNormal">
@@ -1370,6 +1354,8 @@
   </w:compat>
   <w:rsids>
     <w:rsidRoot w:val="006573DA"/>
+    <w:rsid w:val="00115FFF"/>
+    <w:rsid w:val="00341BB8"/>
     <w:rsid w:val="003D50F4"/>
     <w:rsid w:val="006573DA"/>
     <w:rsid w:val="00F509BB"/>
@@ -2138,7 +2124,215 @@
 </a:theme>
 </file>
 
+<file path=_xmlsignatures/sig1.xml><?xml version="1.0" encoding="utf-8"?>
+<Signature xmlns="http://www.w3.org/2000/09/xmldsig#" Id="idPackageSignature">
+  <SignedInfo>
+    <CanonicalizationMethod Algorithm="http://www.w3.org/TR/2001/REC-xml-c14n-20010315"/>
+    <SignatureMethod Algorithm="http://www.w3.org/2001/04/xmldsig-more#rsa-sha256"/>
+    <Reference Type="http://www.w3.org/2000/09/xmldsig#Object" URI="#idPackageObject">
+      <DigestMethod Algorithm="http://www.w3.org/2001/04/xmlenc#sha256"/>
+      <DigestValue>JNi5BgcaAudBEjsowAHm/3NhwXGahTNJMjPddaB2Jgg=</DigestValue>
+    </Reference>
+    <Reference Type="http://www.w3.org/2000/09/xmldsig#Object" URI="#idOfficeObject">
+      <DigestMethod Algorithm="http://www.w3.org/2001/04/xmlenc#sha256"/>
+      <DigestValue>ZOnAh0pbfQFRtCYTf3WW1kt1nURAnlS8G1RIXcQMfY8=</DigestValue>
+    </Reference>
+    <Reference Type="http://uri.etsi.org/01903#SignedProperties" URI="#idSignedProperties">
+      <Transforms>
+        <Transform Algorithm="http://www.w3.org/TR/2001/REC-xml-c14n-20010315"/>
+      </Transforms>
+      <DigestMethod Algorithm="http://www.w3.org/2001/04/xmlenc#sha256"/>
+      <DigestValue>2+QZ58g1Ta+Qd0bBzS1qbwaujgSp9OErTp0TWJUzF/0=</DigestValue>
+    </Reference>
+    <Reference Type="http://www.w3.org/2000/09/xmldsig#Object" URI="#idValidSigLnImg">
+      <DigestMethod Algorithm="http://www.w3.org/2001/04/xmlenc#sha256"/>
+      <DigestValue>1GX+oAQYf/hy2IVgOAdCfQndfJpF6nlQWrcPi8QiN0g=</DigestValue>
+    </Reference>
+    <Reference Type="http://www.w3.org/2000/09/xmldsig#Object" URI="#idInvalidSigLnImg">
+      <DigestMethod Algorithm="http://www.w3.org/2001/04/xmlenc#sha256"/>
+      <DigestValue>9JLRdUlpTEoI9j69fHu9yUes9IzkrSd9bmopILDBnA0=</DigestValue>
+    </Reference>
+  </SignedInfo>
+  <SignatureValue>MhN+fmk2jBrNJVnEPBfpuuCx5w2AGZFKS7XDjg1qSJPKkPWcW5KauSnL3pJbkZzv/BlxBw9q6vZe
+DZB0w2khMSu0iUccFbS+tz9h52lLXOH7rop5Yjct42h6UcaTTPY41HjnqC8OJ6s/9ADNoAeDPBVw
+hPcUc1KWYL/dJgRxAu9JtVOwY54IgwPIi1pXUyUV0W/sCZ2bx0IiXlcwdUAdRYAGhdb0cRx+pVvH
+X+/3JMiOKyrp2ifICvGQ9Hxl0WpRsI6D9M1+EG33FK+hqj768YjIMPAgF44c9mI9jWVZ8bSBBBTD
+/rZcfJbXXdB7BJ9/tbopgw/4O/iEYbazeNB4Ew==</SignatureValue>
+  <KeyInfo>
+    <X509Data>
+      <X509Certificate>MIID8jCCAtqgAwIBAgIQfBMTr19ge7BMZ9scGvX8cTANBgkqhkiG9w0BAQsFADB4MXYwEQYKCZImiZPyLGQBGRYDbmV0MBUGCgmSJomT8ixkARkWB3dpbmRvd3MwHQYDVQQDExZNUy1Pcmdhbml6YXRpb24tQWNjZXNzMCsGA1UECxMkODJkYmFjYTQtM2U4MS00NmNhLTljNzMtMDk1MGMxZWFjYTk3MB4XDTI1MDgwNDIyMTI0M1oXDTM1MDgwNDIyNDI0M1owLzEtMCsGA1UEAxMkZjU3NDA0NmQtODlmZS00NDMyLTg2OWQtYjI2ODAyMThiNWEzMIIBIjANBgkqhkiG9w0BAQEFAAOCAQ8AMIIBCgKCAQEAs8ac3VGM2xQsJ9oZoe0zhkNHhh0p3m4G5p8alkW5Vowv09sVCJvuymw4GZHZjULdofyM7BUChsR7tVLaQ9SLJ22YzCbpVU+0lglwASQzKzi3QHbSBZBpSwqZ9S7MOQbZhyeaqI5R6jKYOP5ZH4LxsRlyLyj6oe/uPfqOpUfaojSW22ufi35XtjHWTatT+46yx994O6fAr8NlilgnMjsFkQ5YyaSb3zYO517uJw6DSGpsZGkDgPFxrqhfsMSqbAHJBG8vGXNa0SZDC5NcbcrQqwW24Lbl4+epsOAbVNKd6EkBLPCMbViEO68w+fQz21XF4pP360S+rvN0cNsMg/VfqwIDAQABo4HAMIG9MAwGA1UdEwEB/wQCMAAwFgYDVR0lAQH/BAwwCgYIKwYBBQUHAwIwIgYLKoZIhvcUAQWCHAIEEwSBEG0EdPX+iTJEhp2yaAIYtaMwIgYLKoZIhvcUAQWCHAMEEwSBEGEUo5sVPYZAnNy1GghZ4/YwIgYLKoZIhvcUAQWCHAUEEwSBEJuQGuoAZiVKgqUMbtfQUTswFAYLKoZIhvcUAQWCHAgEBQSBAkFGMBMGCyqGSIb3FAEFghwHBAQEgQEwMA0GCSqGSIb3DQEBCwUAA4IBAQABDIA0x2FHOZKU/POubV7p8dO5Wq27SFvCw14Yv1vUfzsfBFUw5zvDCxzBnVwziqm0ERXJ/Ug58aq5pzjqDTDmtCHl1B8hB8XMI+e4eOWFMGmCnBcjMjk2np0KVvYN2ZSwIDGFFi/YUVchPduPF8IIglLocrWyna1ZboTf3I1OXbBQUlYZIYngIb3YC2Psp9iMCijmvEyLwuOd9k3e6k8YznP29gsvloAjUg8Tx1TQxoE4AI+H3/efsTGUMgUQ0Ri7Q/dlVfr9kEDVwsw+WA9KfD0e6lZREUGFmYrFnjCdL/7w6Yvs/72xtN6W7tyZ+ZQwfDWDOqyLsWK4HvRe5W1Q</X509Certificate>
+    </X509Data>
+  </KeyInfo>
+  <Object Id="idPackageObject">
+    <Manifest>
+      <Reference URI="/_rels/.rels?ContentType=application/vnd.openxmlformats-package.relationships+xml">
+        <Transforms>
+          <Transform Algorithm="http://schemas.openxmlformats.org/package/2006/RelationshipTransform">
+            <mdssi:RelationshipReference xmlns:mdssi="http://schemas.openxmlformats.org/package/2006/digital-signature" SourceId="rId1"/>
+          </Transform>
+          <Transform Algorithm="http://www.w3.org/TR/2001/REC-xml-c14n-20010315"/>
+        </Transforms>
+        <DigestMethod Algorithm="http://www.w3.org/2001/04/xmlenc#sha256"/>
+        <DigestValue>Mq3mDDWudLiaQFa1psBgLG+/en7p7r8re0MtlxnuiUI=</DigestValue>
+      </Reference>
+      <Reference URI="/word/_rels/document.xml.rels?ContentType=application/vnd.openxmlformats-package.relationships+xml">
+        <Transforms>
+          <Transform Algorithm="http://schemas.openxmlformats.org/package/2006/RelationshipTransform">
+            <mdssi:RelationshipReference xmlns:mdssi="http://schemas.openxmlformats.org/package/2006/digital-signature" SourceId="rId6"/>
+            <mdssi:RelationshipReference xmlns:mdssi="http://schemas.openxmlformats.org/package/2006/digital-signature" SourceId="rId5"/>
+            <mdssi:RelationshipReference xmlns:mdssi="http://schemas.openxmlformats.org/package/2006/digital-signature" SourceId="rId10"/>
+            <mdssi:RelationshipReference xmlns:mdssi="http://schemas.openxmlformats.org/package/2006/digital-signature" SourceId="rId4"/>
+            <mdssi:RelationshipReference xmlns:mdssi="http://schemas.openxmlformats.org/package/2006/digital-signature" SourceId="rId9"/>
+            <mdssi:RelationshipReference xmlns:mdssi="http://schemas.openxmlformats.org/package/2006/digital-signature" SourceId="rId8"/>
+            <mdssi:RelationshipReference xmlns:mdssi="http://schemas.openxmlformats.org/package/2006/digital-signature" SourceId="rId7"/>
+          </Transform>
+          <Transform Algorithm="http://www.w3.org/TR/2001/REC-xml-c14n-20010315"/>
+        </Transforms>
+        <DigestMethod Algorithm="http://www.w3.org/2001/04/xmlenc#sha256"/>
+        <DigestValue>il/1Qn63Vh3mp5ed3NY+TCyN8foVXOF3h0TgORxm9j0=</DigestValue>
+      </Reference>
+      <Reference URI="/word/document.xml?ContentType=application/vnd.openxmlformats-officedocument.wordprocessingml.document.main+xml">
+        <DigestMethod Algorithm="http://www.w3.org/2001/04/xmlenc#sha256"/>
+        <DigestValue>8naN7sGV/W5lObHsjHIUTeBMEm8L8LCGb3BpK/nxgcM=</DigestValue>
+      </Reference>
+      <Reference URI="/word/fontTable.xml?ContentType=application/vnd.openxmlformats-officedocument.wordprocessingml.fontTable+xml">
+        <DigestMethod Algorithm="http://www.w3.org/2001/04/xmlenc#sha256"/>
+        <DigestValue>noVyktsWEvLHmGEDi8/e0w078P5zaEOTeF2/qic1Yec=</DigestValue>
+      </Reference>
+      <Reference URI="/word/glossary/_rels/document.xml.rels?ContentType=application/vnd.openxmlformats-package.relationships+xml">
+        <Transforms>
+          <Transform Algorithm="http://schemas.openxmlformats.org/package/2006/RelationshipTransform">
+            <mdssi:RelationshipReference xmlns:mdssi="http://schemas.openxmlformats.org/package/2006/digital-signature" SourceId="rId1"/>
+            <mdssi:RelationshipReference xmlns:mdssi="http://schemas.openxmlformats.org/package/2006/digital-signature" SourceId="rId4"/>
+            <mdssi:RelationshipReference xmlns:mdssi="http://schemas.openxmlformats.org/package/2006/digital-signature" SourceId="rId3"/>
+            <mdssi:RelationshipReference xmlns:mdssi="http://schemas.openxmlformats.org/package/2006/digital-signature" SourceId="rId2"/>
+          </Transform>
+          <Transform Algorithm="http://www.w3.org/TR/2001/REC-xml-c14n-20010315"/>
+        </Transforms>
+        <DigestMethod Algorithm="http://www.w3.org/2001/04/xmlenc#sha256"/>
+        <DigestValue>tI9MMc4dgyFVN51ZYv0+ie+qLoS977tYmLOtS8YjJ5U=</DigestValue>
+      </Reference>
+      <Reference URI="/word/glossary/document.xml?ContentType=application/vnd.openxmlformats-officedocument.wordprocessingml.document.glossary+xml">
+        <DigestMethod Algorithm="http://www.w3.org/2001/04/xmlenc#sha256"/>
+        <DigestValue>k+F1NScgT/0rzEkEA5Qi0zGnqvjVksqrvBZRTvaEd7I=</DigestValue>
+      </Reference>
+      <Reference URI="/word/glossary/fontTable.xml?ContentType=application/vnd.openxmlformats-officedocument.wordprocessingml.fontTable+xml">
+        <DigestMethod Algorithm="http://www.w3.org/2001/04/xmlenc#sha256"/>
+        <DigestValue>noVyktsWEvLHmGEDi8/e0w078P5zaEOTeF2/qic1Yec=</DigestValue>
+      </Reference>
+      <Reference URI="/word/glossary/settings.xml?ContentType=application/vnd.openxmlformats-officedocument.wordprocessingml.settings+xml">
+        <DigestMethod Algorithm="http://www.w3.org/2001/04/xmlenc#sha256"/>
+        <DigestValue>94xn0vfa/QXpW85WV+R3Q0GhteqsaR93DYb2NYoH2Tc=</DigestValue>
+      </Reference>
+      <Reference URI="/word/glossary/styles.xml?ContentType=application/vnd.openxmlformats-officedocument.wordprocessingml.styles+xml">
+        <DigestMethod Algorithm="http://www.w3.org/2001/04/xmlenc#sha256"/>
+        <DigestValue>JTfohXkLXQYmCJbgBmTZTI5hH7XESfdk5v7HOyWU7/M=</DigestValue>
+      </Reference>
+      <Reference URI="/word/glossary/webSettings.xml?ContentType=application/vnd.openxmlformats-officedocument.wordprocessingml.webSettings+xml">
+        <DigestMethod Algorithm="http://www.w3.org/2001/04/xmlenc#sha256"/>
+        <DigestValue>8vb+dnljSWO/SbrmX5QfQZNN5Czus6gGr6xLq5InSFM=</DigestValue>
+      </Reference>
+      <Reference URI="/word/media/image1.emf?ContentType=image/x-emf">
+        <DigestMethod Algorithm="http://www.w3.org/2001/04/xmlenc#sha256"/>
+        <DigestValue>L7zxluveJA1GHkSz44dyDKplFe+HrzJg63htLvFmqO8=</DigestValue>
+      </Reference>
+      <Reference URI="/word/settings.xml?ContentType=application/vnd.openxmlformats-officedocument.wordprocessingml.settings+xml">
+        <DigestMethod Algorithm="http://www.w3.org/2001/04/xmlenc#sha256"/>
+        <DigestValue>TPwQUjO4zXlLlCa8BOV7l2j8FN+jiE808AXc7+v83YQ=</DigestValue>
+      </Reference>
+      <Reference URI="/word/styles.xml?ContentType=application/vnd.openxmlformats-officedocument.wordprocessingml.styles+xml">
+        <DigestMethod Algorithm="http://www.w3.org/2001/04/xmlenc#sha256"/>
+        <DigestValue>V4xLoDg6KFAqzK4iN1X4E91pZ+jEWfGPpDlzCkrM2iE=</DigestValue>
+      </Reference>
+      <Reference URI="/word/theme/theme1.xml?ContentType=application/vnd.openxmlformats-officedocument.theme+xml">
+        <DigestMethod Algorithm="http://www.w3.org/2001/04/xmlenc#sha256"/>
+        <DigestValue>UoNV+hWN7+aGBxoVh5c8Qc26MFclbfE7LycPDY8Ylvw=</DigestValue>
+      </Reference>
+      <Reference URI="/word/webSettings.xml?ContentType=application/vnd.openxmlformats-officedocument.wordprocessingml.webSettings+xml">
+        <DigestMethod Algorithm="http://www.w3.org/2001/04/xmlenc#sha256"/>
+        <DigestValue>8vb+dnljSWO/SbrmX5QfQZNN5Czus6gGr6xLq5InSFM=</DigestValue>
+      </Reference>
+    </Manifest>
+    <SignatureProperties>
+      <SignatureProperty Id="idSignatureTime" Target="#idPackageSignature">
+        <mdssi:SignatureTime xmlns:mdssi="http://schemas.openxmlformats.org/package/2006/digital-signature">
+          <mdssi:Format>YYYY-MM-DDThh:mm:ssTZD</mdssi:Format>
+          <mdssi:Value>2026-09-09T12:22:56Z</mdssi:Value>
+        </mdssi:SignatureTime>
+      </SignatureProperty>
+    </SignatureProperties>
+  </Object>
+  <Object Id="idOfficeObject">
+    <SignatureProperties>
+      <SignatureProperty Id="idOfficeV1Details" Target="#idPackageSignature">
+        <SignatureInfoV1 xmlns="http://schemas.microsoft.com/office/2006/digsig">
+          <SetupID>{2E52318D-CB36-4713-81DC-6D44E8BDD947}</SetupID>
+          <SignatureText>Karabo Masoka</SignatureText>
+          <SignatureImage/>
+          <SignatureComments/>
+          <WindowsVersion>10.0</WindowsVersion>
+          <OfficeVersion>16.0.20326/27</OfficeVersion>
+          <ApplicationVersion>16.0.20326</ApplicationVersion>
+          <Monitors>1</Monitors>
+          <HorizontalResolution>1920</HorizontalResolution>
+          <VerticalResolution>1080</VerticalResolution>
+          <ColorDepth>32</ColorDepth>
+          <SignatureProviderId>{00000000-0000-0000-0000-000000000000}</SignatureProviderId>
+          <SignatureProviderUrl/>
+          <SignatureProviderDetails>9</SignatureProviderDetails>
+          <SignatureType>2</SignatureType>
+        </SignatureInfoV1>
+      </SignatureProperty>
+    </SignatureProperties>
+  </Object>
+  <Object>
+    <xd:QualifyingProperties xmlns:xd="http://uri.etsi.org/01903/v1.3.2#" Target="#idPackageSignature">
+      <xd:SignedProperties Id="idSignedProperties">
+        <xd:SignedSignatureProperties>
+          <xd:SigningTime>2026-09-09T12:22:56Z</xd:SigningTime>
+          <xd:SigningCertificate>
+            <xd:Cert>
+              <xd:CertDigest>
+                <DigestMethod Algorithm="http://www.w3.org/2001/04/xmlenc#sha256"/>
+                <DigestValue>utJtnC4bvV2U5DHJJMpkBH0AZEsc2/SXQl6GyRa8IDM=</DigestValue>
+              </xd:CertDigest>
+              <xd:IssuerSerial>
+                <X509IssuerName>DC=net + DC=windows + CN=MS-Organization-Access + OU=82dbaca4-3e81-46ca-9c73-0950c1eaca97</X509IssuerName>
+                <X509SerialNumber>164923324377870356257932034625093631089</X509SerialNumber>
+              </xd:IssuerSerial>
+            </xd:Cert>
+          </xd:SigningCertificate>
+          <xd:SignaturePolicyIdentifier>
+            <xd:SignaturePolicyImplied/>
+          </xd:SignaturePolicyIdentifier>
+        </xd:SignedSignatureProperties>
+        <xd:SignedDataObjectProperties>
+          <xd:CommitmentTypeIndication>
+            <xd:CommitmentTypeId>
+              <xd:Identifier>http://uri.etsi.org/01903/v1.2.2#ProofOfApproval</xd:Identifier>
+              <xd:Description>Approved this document</xd:Description>
+            </xd:CommitmentTypeId>
+            <xd:AllSignedDataObjects/>
+          </xd:CommitmentTypeIndication>
+        </xd:SignedDataObjectProperties>
+      </xd:SignedProperties>
+    </xd:QualifyingProperties>
+  </Object>
+  <Object Id="idValidSigLnImg">AQAAAGwAAAAAAAAAAAAAAFABAACfAAAAAAAAAAAAAACWFwAAOwsAACBFTUYAAAEAiBoAAKIAAAAGAAAAAAAAAAAAAAAAAAAAgAcAADgEAABYAQAAwgAAAAAAAAAAAAAAAAAAAMA/BQDQ9QIACgAAABAAAAAAAAAAAAAAAEsAAAAQAAAAAAAAAAUAAAAeAAAAGAAAAAAAAAAAAAAAUQEAAKAAAAAnAAAAGAAAAAEAAAAAAAAAAAAAAAAAAAAlAAAADAAAAAEAAABMAAAAZAAAAAAAAAAAAAAAUAEAAJ8AAAAAAAAAAAAAAFEBAACgAAAAIQDwAAAAAAAAAAAAAACAPwAAAAAAAAAAAACAPwAAAAAAAAAAAAAAAAAAAAAAAAAAAAAAAAAAAAAAAAAAJQAAAAwAAAAAAACAKAAAAAwAAAABAAAAJwAAABgAAAABAAAAAAAAAP///wAAAAAAJQAAAAwAAAABAAAATAAAAGQAAAAAAAAAAAAAAD8BAACfAAAAAAAAAAAAAABAAQAAoAAAACEA8AAAAAAAAAAAAAAAgD8AAAAAAAAAAAAAgD8AAAAAAAAAAAAAAAAAAAAAAAAAAAAAAAAAAAAAAAAAACUAAAAMAAAAAAAAgCgAAAAMAAAAAQAAACcAAAAYAAAAAQAAAAAAAADw8PAAAAAAACUAAAAMAAAAAQAAAEwAAABkAAAAAAAAAAAAAABQAQAAnwAAAAAAAAAAAAAAUQEAAKAAAAAhAPAAAAAAAAAAAAAAAIA/AAAAAAAAAAAAAIA/AAAAAAAAAAAAAAAAAAAAAAAAAAAAAAAAAAAAAAAAAAAlAAAADAAAAAAAAIAoAAAADAAAAAEAAAAnAAAAGAAAAAEAAAAAAAAA8PDwAAAAAAAlAAAADAAAAAEAAABMAAAAZAAAAAAAAAAAAAAAUAEAAJ8AAAAAAAAAAAAAAFEBAACgAAAAIQDwAAAAAAAAAAAAAACAPwAAAAAAAAAAAACAPwAAAAAAAAAAAAAAAAAAAAAAAAAAAAAAAAAAAAAAAAAAJQAAAAwAAAAAAACAKAAAAAwAAAABAAAAJwAAABgAAAABAAAAAAAAAPDw8AAAAAAAJQAAAAwAAAABAAAATAAAAGQAAAAAAAAAAAAAAFABAACfAAAAAAAAAAAAAABRAQAAoAAAACEA8AAAAAAAAAAAAAAAgD8AAAAAAAAAAAAAgD8AAAAAAAAAAAAAAAAAAAAAAAAAAAAAAAAAAAAAAAAAACUAAAAMAAAAAAAAgCgAAAAMAAAAAQAAACcAAAAYAAAAAQAAAAAAAADw8PAAAAAAACUAAAAMAAAAAQAAAEwAAABkAAAAAAAAAAAAAABQAQAAnwAAAAAAAAAAAAAAUQEAAKAAAAAhAPAAAAAAAAAAAAAAAIA/AAAAAAAAAAAAAIA/AAAAAAAAAAAAAAAAAAAAAAAAAAAAAAAAAAAAAAAAAAAlAAAADAAAAAAAAIAoAAAADAAAAAEAAAAnAAAAGAAAAAEAAAAAAAAA////AAAAAAAlAAAADAAAAAEAAABMAAAAZAAAAAAAAAAAAAAAUAEAAJ8AAAAAAAAAAAAAAFEBAACgAAAAIQDwAAAAAAAAAAAAAACAPwAAAAAAAAAAAACAPwAAAAAAAAAAAAAAAAAAAAAAAAAAAAAAAAAAAAAAAAAAJQAAAAwAAAAAAACAKAAAAAwAAAABAAAAJwAAABgAAAABAAAAAAAAAP///wAAAAAAJQAAAAwAAAABAAAATAAAAGQAAAAAAAAAAAAAAFABAACfAAAAAAAAAAAAAABRAQAAoAAAACEA8AAAAAAAAAAAAAAAgD8AAAAAAAAAAAAAgD8AAAAAAAAAAAAAAAAAAAAAAAAAAAAAAAAAAAAAAAAAACUAAAAMAAAAAAAAgCgAAAAMAAAAAQAAACcAAAAYAAAAAQAAAAAAAAD///8AAAAAACUAAAAMAAAAAQAAAEwAAABkAAAAAAAAAAQAAAA/AQAAFwAAAAAAAAAEAAAAQAEAABQAAAAhAPAAAAAAAAAAAAAAAIA/AAAAAAAAAAAAAIA/AAAAAAAAAAAAAAAAAAAAAAAAAAAAAAAAAAAAAAAAAAAlAAAADAAAAAAAAIAoAAAADAAAAAEAAAAnAAAAGAAAAAEAAAAAAAAA////AAAAAAAlAAAADAAAAAEAAABMAAAAZAAAAO4AAAAFAAAAMQEAABUAAADuAAAABQAAAEQAAAARAAAAIQDwAAAAAAAAAAAAAACAPwAAAAAAAAAAAACAPwAAAAAAAAAAAAAAAAAAAAAAAAAAAAAAAAAAAAAAAAAAJQAAAAwAAAAAAACAKAAAAAwAAAABAAAAUgAAAHABAAABAAAA8////wAAAAAAAAAAAAAAAJABAAAAAAABAAAAAHMAZQBnAG8AZQAgAHUAaQAAAAAAAAAAAAAAAAAAAAAAAAAAAAAAAAAAAAAAAAAAAAAAAAAAAAAAAAAAAAAAAAAAAAAAAAAAAAAAAAAAAAAAAAAAAAAAAAAAAAAAAAAAAAAAAAAAAAAAAAAAAAAAAAAAAAAAAAAAAAAAAAAAAAAAAAAAAAAAAAAAAAAAAAAAAAAAAAAAAAAAAAAAAAAAAAAAAAAAAAAAAAAAAAAAAAAAAAAAAAAAAAAAAAAAAAAAAAAAAAAAAAAAAAAAAAAAAAAAAAAAAAAAAAAAAAAAAAAAAAAAAAAAAAAAAAAAAAAAAAAAAAAAAAAAAAAAAAAAAAAAAAAAAAAAAAAAAAAAAAAAAAAAAAAAAAAAAAAAAAAAAAAAAAAAAAAAAAAAAAAAAAAAAAAAAAAAAAAAAAAAAAAAZHYACAAAAAAlAAAADAAAAAEAAAAYAAAADAAAAAAAAAASAAAADAAAAAEAAAAeAAAAGAAAAO4AAAAFAAAAMgEAABYAAAAlAAAADAAAAAEAAABUAAAAiAAAAO8AAAAFAAAAMAEAABUAAAABAAAAVVWPQSa0j0HvAAAABQAAAAoAAABMAAAAAAAAAAAAAAAAAAAA//////////9gAAAAMgAwADIANgAvADAAOQAvADAAOQAHAAAABwAAAAcAAAAHAAAABQAAAAcAAAAHAAAABQAAAAcAAAAHAAAASwAAAEAAAAAwAAAABQAAACAAAAABAAAAAQAAABAAAAAAAAAAAAAAAFEBAACgAAAAAAAAAAAAAABRAQAAoAAAAFIAAABwAQAAAgAAABQAAAAJAAAAAAAAAAAAAAC8AgAAAAAAAAECAiJTAHkAcwB0AGUAbQAAAAAAAAAAAAAAAAAAAAAAAAAAAAAAAAAAAAAAAAAAAAAAAAAAAAAAAAAAAAAAAAAAAAAAAAAAAAAAAAAAAAAAAAAAAAAAAAAAAAAAAAAAAAAAAAAAAAAAAAAAAAAAAAAAAAAAAAAAAAAAAAAAAAAAAAAAAAAAAAAAAAAAAAAAAAAAAAAAAAAAAAAAAAAAAAAAAAAAAAAAAAAAAAAAAAAAAAAAAAAAAAAAAAAAAAAAAAAAAAAAAAAAAAAAAAAAAAAAAAAAAAAAAAAAAAAAAAAAAAAAAAAAAAAAAAAAAAAAAAAAAAAAAAAAAAAAAAAAAAAAAAAAAAAAAAAAAAAAAAAAAAAAAAAAAAAAAAAAAAAAAAAAAAAAAAAAAAAAAAAAAAAAAAAAAAAAAAAAAAAAAAAAAAAAAGR2AAgAAAAAJQAAAAwAAAACAAAAJwAAABgAAAADAAAAAAAAAAAAAAAAAAAAJQAAAAwAAAADAAAATAAAAGQAAAAAAAAAAAAAAP//////////AAAAABwAAAAAAAAAPwAAACEA8AAAAAAAAAAAAAAAgD8AAAAAAAAAAAAAgD8AAAAAAAAAAAAAAAAAAAAAAAAAAAAAAAAAAAAAAAAAACUAAAAMAAAAAAAAgCgAAAAMAAAAAwAAACcAAAAYAAAAAwAAAAAAAAAAAAAAAAAAACUAAAAMAAAAAwAAAEwAAABkAAAAAAAAAAAAAAD//////////wAAAAAcAAAAQAEAAAAAAAAhAPAAAAAAAAAAAAAAAIA/AAAAAAAAAAAAAIA/AAAAAAAAAAAAAAAAAAAAAAAAAAAAAAAAAAAAAAAAAAAlAAAADAAAAAAAAIAoAAAADAAAAAMAAAAnAAAAGAAAAAMAAAAAAAAAAAAAAAAAAAAlAAAADAAAAAMAAABMAAAAZAAAAAAAAAAAAAAA//////////9AAQAAHAAAAAAAAAA/AAAAIQDwAAAAAAAAAAAAAACAPwAAAAAAAAAAAACAPwAAAAAAAAAAAAAAAAAAAAAAAAAAAAAAAAAAAAAAAAAAJQAAAAwAAAAAAACAKAAAAAwAAAADAAAAJwAAABgAAAADAAAAAAAAAAAAAAAAAAAAJQAAAAwAAAADAAAATAAAAGQAAAAAAAAAWwAAAD8BAABcAAAAAAAAAFsAAABAAQAAAgAAACEA8AAAAAAAAAAAAAAAgD8AAAAAAAAAAAAAgD8AAAAAAAAAAAAAAAAAAAAAAAAAAAAAAAAAAAAAAAAAACUAAAAMAAAAAAAAgCgAAAAMAAAAAwAAACcAAAAYAAAAAwAAAAAAAAD///8AAAAAACUAAAAMAAAAAwAAAEwAAABkAAAAAAAAABwAAAA/AQAAWgAAAAAAAAAcAAAAQAEAAD8AAAAhAPAAAAAAAAAAAAAAAIA/AAAAAAAAAAAAAIA/AAAAAAAAAAAAAAAAAAAAAAAAAAAAAAAAAAAAAAAAAAAlAAAADAAAAAAAAIAoAAAADAAAAAMAAAAnAAAAGAAAAAMAAAAAAAAA////AAAAAAAlAAAADAAAAAMAAABMAAAAZAAAAAsAAAA3AAAAIQAAAFoAAAALAAAANwAAABcAAAAkAAAAIQDwAAAAAAAAAAAAAACAPwAAAAAAAAAAAACAPwAAAAAAAAAAAAAAAAAAAAAAAAAAAAAAAAAAAAAAAAAAJQAAAAwAAAAAAACAKAAAAAwAAAADAAAAUgAAAHABAAADAAAA4P///wAAAAAAAAAAAAAAAJABAAAAAAABAAAAAGEAcgBpAGEAbAAAAAAAAAAAAAAAAAAAAAAAAAAAAAAAAAAAAAAAAAAAAAAAAAAAAAAAAAAAAAAAAAAAAAAAAAAAAAAAAAAAAAAAAAAAAAAAAAAAAAAAAAAAAAAAAAAAAAAAAAAAAAAAAAAAAAAAAAAAAAAAAAAAAAAAAAAAAAAAAAAAAAAAAAAAAAAAAAAAAAAAAAAAAAAAAAAAAAAAAAAAAAAAAAAAAAAAAAAAAAAAAAAAAAAAAAAAAAAAAAAAAAAAAAAAAAAAAAAAAAAAAAAAAAAAAAAAAAAAAAAAAAAAAAAAAAAAAAAAAAAAAAAAAAAAAAAAAAAAAAAAAAAAAAAAAAAAAAAAAAAAAAAAAAAAAAAAAAAAAAAAAAAAAAAAAAAAAAAAAAAAAAAAAAAAAAAAAAAAAAAAAAAAAAAAAAAAZHYACAAAAAAlAAAADAAAAAMAAAAYAAAADAAAAAAAAAASAAAADAAAAAEAAAAWAAAADAAAAAgAAABUAAAAVAAAAAwAAAA3AAAAIAAAAFoAAAABAAAAVVWPQSa0j0EMAAAAWwAAAAEAAABMAAAABAAAAAsAAAA3AAAAIgAAAFsAAABQAAAAWAAAABUAAAAWAAAADAAAAAAAAAAlAAAADAAAAAIAAAAnAAAAGAAAAAQAAAAAAAAA////AAAAAAAlAAAADAAAAAQAAABMAAAAZAAAADAAAAAgAAAANAEAAFoAAAAwAAAAIAAAAAUBAAA7AAAAIQDwAAAAAAAAAAAAAACAPwAAAAAAAAAAAACAPwAAAAAAAAAAAAAAAAAAAAAAAAAAAAAAAAAAAAAAAAAAJQAAAAwAAAAAAACAKAAAAAwAAAAEAAAAJwAAABgAAAAEAAAAAAAAAP///wAAAAAAJQAAAAwAAAAEAAAATAAAAGQAAAAwAAAAIAAAADQBAABWAAAAMAAAACAAAAAFAQAANwAAACEA8AAAAAAAAAAAAAAAgD8AAAAAAAAAAAAAgD8AAAAAAAAAAAAAAAAAAAAAAAAAAAAAAAAAAAAAAAAAACUAAAAMAAAAAAAAgCgAAAAMAAAABAAAACcAAAAYAAAABAAAAAAAAAD///8AAAAAACUAAAAMAAAABAAAAEwAAABkAAAAMAAAADsAAAC5AAAAVgAAADAAAAA7AAAAigAAABwAAAAhAPAAAAAAAAAAAAAAAIA/AAAAAAAAAAAAAIA/AAAAAAAAAAAAAAAAAAAAAAAAAAAAAAAAAAAAAAAAAAAlAAAADAAAAAAAAIAoAAAADAAAAAQAAABSAAAAcAEAAAQAAADs////AAAAAAAAAAAAAAAAkAEAAAAAAAEAAAAAcwBlAGcAbwBlACAAdQBpAAAAAAAAAAAAAAAAAAAAAAAAAAAAAAAAAAAAAAAAAAAAAAAAAAAAAAAAAAAAAAAAAAAAAAAAAAAAAAAAAAAAAAAAAAAAAAAAAAAAAAAAAAAAAAAAAAAAAAAAAAAAAAAAAAAAAAAAAAAAAAAAAAAAAAAAAAAAAAAAAAAAAAAAAAAAAAAAAAAAAAAAAAAAAAAAAAAAAAAAAAAAAAAAAAAAAAAAAAAAAAAAAAAAAAAAAAAAAAAAAAAAAAAAAAAAAAAAAAAAAAAAAAAAAAAAAAAAAAAAAAAAAAAAAAAAAAAAAAAAAAAAAAAAAAAAAAAAAAAAAAAAAAAAAAAAAAAAAAAAAAAAAAAAAAAAAAAAAAAAAAAAAAAAAAAAAAAAAAAAAAAAAAAAAAAAAAAAAAAAAAAAAABkdgAIAAAAACUAAAAMAAAABAAAABgAAAAMAAAAAAAAABIAAAAMAAAAAQAAAB4AAAAYAAAAMAAAADsAAAC6AAAAVwAAACUAAAAMAAAABAAAAFQAAACcAAAAMQAAADsAAAC4AAAAVgAAAAEAAABVVY9BJrSPQTEAAAA7AAAADQAAAEwAAAAAAAAAAAAAAAAAAAD//////////2gAAABLAGEAcgBhAGIAbwAgAE0AYQBzAG8AawBhAAAADAAAAAoAAAAHAAAACgAAAAwAAAAMAAAABQAAABIAAAAKAAAACAAAAAwAAAAKAAAACgAAAEsAAABAAAAAMAAAAAUAAAAgAAAAAQAAAAEAAAAQAAAAAAAAAAAAAABRAQAAoAAAAAAAAAAAAAAAUQEAAKAAAAAlAAAADAAAAAIAAAAnAAAAGAAAAAUAAAAAAAAA////AAAAAAAlAAAADAAAAAUAAABMAAAAZAAAAAAAAABhAAAAUAEAAJsAAAAAAAAAYQAAAFEBAAA7AAAAIQDwAAAAAAAAAAAAAACAPwAAAAAAAAAAAACAPwAAAAAAAAAAAAAAAAAAAAAAAAAAAAAAAAAAAAAAAAAAJQAAAAwAAAAAAACAKAAAAAwAAAAFAAAAJwAAABgAAAAFAAAAAAAAAP///wAAAAAAJQAAAAwAAAAFAAAATAAAAGQAAAAOAAAAYQAAAD8BAABxAAAADgAAAGEAAAAyAQAAEQAAACEA8AAAAAAAAAAAAAAAgD8AAAAAAAAAAAAAgD8AAAAAAAAAAAAAAAAAAAAAAAAAAAAAAAAAAAAAAAAAACUAAAAMAAAAAAAAgCgAAAAMAAAABQAAACUAAAAMAAAAAQAAABgAAAAMAAAAAAAAABIAAAAMAAAAAQAAAB4AAAAYAAAADgAAAGEAAABAAQAAcgAAACUAAAAMAAAAAQAAAFQAAACEAAAADwAAAGEAAABFAAAAcQAAAAEAAABVVY9BJrSPQQ8AAABhAAAACQAAAEwAAAAAAAAAAAAAAAAAAAD//////////2AAAABTAGkAZwBuAGEAdAB1AHIAZQAAAAcAAAADAAAACAAAAAcAAAAHAAAABAAAAAcAAAAFAAAABwAAAEsAAABAAAAAMAAAAAUAAAAgAAAAAQAAAAEAAAAQAAAAAAAAAAAAAABRAQAAoAAAAAAAAAAAAAAAUQEAAKAAAAAlAAAADAAAAAIAAAAnAAAAGAAAAAUAAAAAAAAA////AAAAAAAlAAAADAAAAAUAAABMAAAAZAAAAA4AAAB2AAAAPwEAAIYAAAAOAAAAdgAAADIBAAARAAAAIQDwAAAAAAAAAAAAAACAPwAAAAAAAAAAAACAPwAAAAAAAAAAAAAAAAAAAAAAAAAAAAAAAAAAAAAAAAAAJQAAAAwAAAAAAACAKAAAAAwAAAAFAAAAJwAAABgAAAAFAAAAAAAAAP///wAAAAAAJQAAAAwAAAAFAAAATAAAAGQAAAAOAAAAiwAAAEIBAACbAAAADgAAAIsAAAA1AQAAEQAAACEA8AAAAAAAAAAAAAAAgD8AAAAAAAAAAAAAgD8AAAAAAAAAAAAAAAAAAAAAAAAAAAAAAAAAAAAAAAAAACUAAAAMAAAAAAAAgCgAAAAMAAAABQAAACUAAAAMAAAAAQAAABgAAAAMAAAAAAAAABIAAAAMAAAAAQAAABYAAAAMAAAAAAAAAFQAAABoAQAADwAAAIsAAABBAQAAmwAAAAEAAABVVY9BJrSPQQ8AAACLAAAALwAAAEwAAAAEAAAADgAAAIsAAABDAQAAnAAAAKwAAABTAGkAZwBuAGUAZAAgAGIAeQA6ACAAZgA1ADcANAAwADQANgBkAC0AOAA5AGYAZQAtADQANAAzADIALQA4ADYAOQBkAC0AYgAyADYAOAAwADIAMQA4AGIANQBhADMAAAAHAAAAAwAAAAgAAAAHAAAABwAAAAgAAAAEAAAACAAAAAYAAAADAAAABAAAAAQAAAAHAAAABwAAAAcAAAAHAAAABwAAAAcAAAAIAAAABQAAAAcAAAAHAAAABAAAAAcAAAAFAAAABwAAAAcAAAAHAAAABwAAAAUAAAAHAAAABwAAAAcAAAAIAAAABQAAAAgAAAAHAAAABwAAAAcAAAAHAAAABwAAAAcAAAAHAAAACAAAAAcAAAAHAAAABwAAABYAAAAMAAAAAAAAACUAAAAMAAAAAgAAAA4AAAAUAAAAAAAAABAAAAAUAAAA</Object>
+  <Object Id="idInvalidSigLnImg">AQAAAGwAAAAAAAAAAAAAAFABAACfAAAAAAAAAAAAAACWFwAAOwsAACBFTUYAAAEAECEAAKkAAAAGAAAAAAAAAAAAAAAAAAAAgAcAADgEAABYAQAAwgAAAAAAAAAAAAAAAAAAAMA/BQDQ9QIACgAAABAAAAAAAAAAAAAAAEsAAAAQAAAAAAAAAAUAAAAeAAAAGAAAAAAAAAAAAAAAUQEAAKAAAAAnAAAAGAAAAAEAAAAAAAAAAAAAAAAAAAAlAAAADAAAAAEAAABMAAAAZAAAAAAAAAAAAAAAUAEAAJ8AAAAAAAAAAAAAAFEBAACgAAAAIQDwAAAAAAAAAAAAAACAPwAAAAAAAAAAAACAPwAAAAAAAAAAAAAAAAAAAAAAAAAAAAAAAAAAAAAAAAAAJQAAAAwAAAAAAACAKAAAAAwAAAABAAAAJwAAABgAAAABAAAAAAAAAP///wAAAAAAJQAAAAwAAAABAAAATAAAAGQAAAAAAAAAAAAAAD8BAACfAAAAAAAAAAAAAABAAQAAoAAAACEA8AAAAAAAAAAAAAAAgD8AAAAAAAAAAAAAgD8AAAAAAAAAAAAAAAAAAAAAAAAAAAAAAAAAAAAAAAAAACUAAAAMAAAAAAAAgCgAAAAMAAAAAQAAACcAAAAYAAAAAQAAAAAAAADw8PAAAAAAACUAAAAMAAAAAQAAAEwAAABkAAAAAAAAAAAAAABQAQAAnwAAAAAAAAAAAAAAUQEAAKAAAAAhAPAAAAAAAAAAAAAAAIA/AAAAAAAAAAAAAIA/AAAAAAAAAAAAAAAAAAAAAAAAAAAAAAAAAAAAAAAAAAAlAAAADAAAAAAAAIAoAAAADAAAAAEAAAAnAAAAGAAAAAEAAAAAAAAA8PDwAAAAAAAlAAAADAAAAAEAAABMAAAAZAAAAAAAAAAAAAAAUAEAAJ8AAAAAAAAAAAAAAFEBAACgAAAAIQDwAAAAAAAAAAAAAACAPwAAAAAAAAAAAACAPwAAAAAAAAAAAAAAAAAAAAAAAAAAAAAAAAAAAAAAAAAAJQAAAAwAAAAAAACAKAAAAAwAAAABAAAAJwAAABgAAAABAAAAAAAAAPDw8AAAAAAAJQAAAAwAAAABAAAATAAAAGQAAAAAAAAAAAAAAFABAACfAAAAAAAAAAAAAABRAQAAoAAAACEA8AAAAAAAAAAAAAAAgD8AAAAAAAAAAAAAgD8AAAAAAAAAAAAAAAAAAAAAAAAAAAAAAAAAAAAAAAAAACUAAAAMAAAAAAAAgCgAAAAMAAAAAQAAACcAAAAYAAAAAQAAAAAAAADw8PAAAAAAACUAAAAMAAAAAQAAAEwAAABkAAAAAAAAAAAAAABQAQAAnwAAAAAAAAAAAAAAUQEAAKAAAAAhAPAAAAAAAAAAAAAAAIA/AAAAAAAAAAAAAIA/AAAAAAAAAAAAAAAAAAAAAAAAAAAAAAAAAAAAAAAAAAAlAAAADAAAAAAAAIAoAAAADAAAAAEAAAAnAAAAGAAAAAEAAAAAAAAA////AAAAAAAlAAAADAAAAAEAAABMAAAAZAAAAAAAAAAAAAAAUAEAAJ8AAAAAAAAAAAAAAFEBAACgAAAAIQDwAAAAAAAAAAAAAACAPwAAAAAAAAAAAACAPwAAAAAAAAAAAAAAAAAAAAAAAAAAAAAAAAAAAAAAAAAAJQAAAAwAAAAAAACAKAAAAAwAAAABAAAAJwAAABgAAAABAAAAAAAAAP///wAAAAAAJQAAAAwAAAABAAAATAAAAGQAAAAAAAAAAAAAAFABAACfAAAAAAAAAAAAAABRAQAAoAAAACEA8AAAAAAAAAAAAAAAgD8AAAAAAAAAAAAAgD8AAAAAAAAAAAAAAAAAAAAAAAAAAAAAAAAAAAAAAAAAACUAAAAMAAAAAAAAgCgAAAAMAAAAAQAAACcAAAAYAAAAAQAAAAAAAAD///8AAAAAACUAAAAMAAAAAQAAAEwAAABkAAAAAAAAAAQAAAA/AQAAFwAAAAAAAAAEAAAAQAEAABQAAAAhAPAAAAAAAAAAAAAAAIA/AAAAAAAAAAAAAIA/AAAAAAAAAAAAAAAAAAAAAAAAAAAAAAAAAAAAAAAAAAAlAAAADAAAAAAAAIAoAAAADAAAAAEAAAAnAAAAGAAAAAEAAAAAAAAA////AAAAAAAlAAAADAAAAAEAAABMAAAAZAAAAA4AAAAEAAAAIQAAABcAAAAOAAAABAAAABQAAAAUAAAAIQDwAAAAAAAAAAAAAACAPwAAAAAAAAAAAACAPwAAAAAAAAAAAAAAAAAAAAAAAAAAAAAAAAAAAAAAAAAAJQAAAAwAAAAAAACAKAAAAAwAAAABAAAAFQAAAAwAAAADAAAAcgAAALAFAAAQAAAABQAAAB8AAAAUAAAAEAAAAAUAAAAQAAAAEAAAAAAA/wEAAAAAAAAAAAAAgD8AAAAAAAAAAAAAgD8AAAAAAAAAAP///wAAAAAAbAAAADQAAACgAAAAEAUAABAAAAAQAAAAKAAAABIAAAASAAAAAQAgAAMAAAAQBQAAAAAAAAAAAAAAAAAAAAAAAAAA/wAA/wAA/wAAAAAAAAAAAAAAAAAAAAAAAAAAAAAAAAAAAAAAAAAAAAAAAAAAAAAAAAAAAAAAAAAAAAAAAAAAAAAAAAAAAAAAAAAAAAAAAAAAAAAAAAAAAAAAAAAAAAAAAAAAAAAAAAAAAAAAAAAAAAAAAAAAAAAAAAAAAAAAAAAAAAAAAAAAAAAAAAAAAAAAAAAAAAAAAAAAAAAAAAAAAAAAAAAAAAAAAAArLCzDCwsLMQAAAAAAAAAAAAAAAC0us8ETE0tRAAAAAAAAAAAAAAAAExNLUS0us8EAAAAAAAAAAAAAAAAAAAAAAAAAAAAAAAA4Ojr/PkBA+SEiIpcLCwsxBgYGHBMTS1E1N9bmExNLUQAAAAATE0tRNTfW5hMTS1EAAAAAAAAAAAAAAAAAAAAAAAAAAAAAAAA4Ojr/5eXl/3R2dvg4Ojr/g4SE5h4eHh8TE0tRNTfW5h4fd4A1N9bmExNLUQAAAAAAAAAAAAAAAAAAAAAAAAAAAAAAAAAAAAA4Ojr/+vr6//r6+v/6+vr/+vr6/8HBwcUAAAAAHh93gDs97f8eH3eAAAAAAAAAAAAAAAAAAAAAAAAAAAAAAAAAAAAAAAAAAAA4Ojr/+vr6//r6+v/6+vr/3t7e4h4eHh8TE0tRNTfW5h4fd4A1N9bmExNLUQAAAAAAAAAAAAAAAAAAAAAAAAAAAAAAAAAAAAA4Ojr/+vr6//r6+v/e3t7iHh4eHxMTS1E1N9bmExNLUQAAAAATE0tRNTfW5hMTS1EAAAAAAAAAAAAAAAAAAAAAAAAAAAAAAAA4Ojr/+vr6//r6+v88PDw9AAAAAC0us8ETE0tRAAAAAAAAAAAAAAAAExNLUS0us8EAAAAAAAAAAAAAAAAAAAAAAAAAAAAAAAA4Ojr/kZKS/05QUP9UVlb6ISEhOAAAAAAGBgYcAAAAAAAAAAAAAAAAAAAAAAAAAAAAAAAAAAAAAAAAAAAAAAAAAAAAAAAAAAA4Ojr/cXJy/9XV1f/6+vr/zMzM5Ts7O1JERkbpAAAAAAAAAAAAAAAAAAAAAAAAAAAAAAAAAAAAAAAAAAAAAAAAAAAAAB4fH4poaWn3+vr6//r6+v/6+vr/+vr6//r6+v9oaWn3Hh8figAAAAAAAAAAAAAAAAAAAAAAAAAAAAAAAAAAAAAAAAAAAAAAAEJERPLV1dX/+vr6//r6+v/6+vr/+vr6//r6+v/V1dX/QkRE8gAAAAAAAAAAAAAAAAAAAAAAAAAAAAAAAAAAAAAAAAAAAAAAADg6Ov/6+vr/+vr6//r6+v/6+vr/+vr6//r6+v/6+vr/ODo6/wAAAAAAAAAAAAAAAAAAAAAAAAAAAAAAAAAAAAAAAAAAAAAAAERGRvTV1dX/+vr6//r6+v/6+vr/+vr6//r6+v/V1dX/REZG9AAAAAAAAAAAAAAAAAAAAAAAAAAAAAAAAAAAAAAAAAAAAAAAACwtLZhub2/8+vr6//r6+v/6+vr/+vr6//r6+v9ub2/8LC0tmAAAAAAAAAAAAAAAAAAAAAAAAAAAAAAAAAAAAAAAAAAAAAAAAAYGBhxERkbpbm9v/NXV1f/6+vr/1dXV/25vb/xHSUnsBgYGHAAAAAAAAAAAAAAAAAAAAAAAAAAAAAAAAAAAAAAAAAAAAAAAAAAAAAAGBgYcOjs7pkVHR/Y4Ojr/RUdH9jo7O6YGBgYcAAAAAAAAAAAAAAAAAAAAAAAAAAAAAAAAAAAAACcAAAAYAAAAAQAAAAAAAAD///8AAAAAACUAAAAMAAAAAQAAAEwAAABkAAAAMAAAAAUAAACQAAAAFQAAADAAAAAFAAAAYQAAABEAAAAhAPAAAAAAAAAAAAAAAIA/AAAAAAAAAAAAAIA/AAAAAAAAAAAAAAAAAAAAAAAAAAAAAAAAAAAAAAAAAAAlAAAADAAAAAAAAIAoAAAADAAAAAEAAABSAAAAcAEAAAEAAADz////AAAAAAAAAAAAAAAAkAEAAAAAAAEAAAAAcwBlAGcAbwBlACAAdQBpAAAAAAAAAAAAAAAAAAAAAAAAAAAAAAAAAAAAAAAAAAAAAAAAAAAAAAAAAAAAAAAAAAAAAAAAAAAAAAAAAAAAAAAAAAAAAAAAAAAAAAAAAAAAAAAAAAAAAAAAAAAAAAAAAAAAAAAAAAAAAAAAAAAAAAAAAAAAAAAAAAAAAAAAAAAAAAAAAAAAAAAAAAAAAAAAAAAAAAAAAAAAAAAAAAAAAAAAAAAAAAAAAAAAAAAAAAAAAAAAAAAAAAAAAAAAAAAAAAAAAAAAAAAAAAAAAAAAAAAAAAAAAAAAAAAAAAAAAAAAAAAAAAAAAAAAAAAAAAAAAAAAAAAAAAAAAAAAAAAAAAAAAAAAAAAAAAAAAAAAAAAAAAAAAAAAAAAAAAAAAAAAAAAAAAAAAAAAAAAAAAAAAABkdgAIAAAAACUAAAAMAAAAAQAAABgAAAAMAAAA/wAAABIAAAAMAAAAAQAAAB4AAAAYAAAAMAAAAAUAAACRAAAAFgAAACUAAAAMAAAAAQAAAFQAAAC0AAAAMQAAAAUAAACPAAAAFQAAAAEAAABVVY9BJrSPQTEAAAAFAAAAEQAAAEwAAAAAAAAAAAAAAAAAAAD//////////3AAAABJAG4AdgBhAGwAaQBkACAAcwBpAGcAbgBhAHQAdQByAGUAAAADAAAABwAAAAYAAAAHAAAAAwAAAAMAAAAIAAAABAAAAAYAAAADAAAACAAAAAcAAAAHAAAABAAAAAcAAAAFAAAABwAAAEsAAABAAAAAMAAAAAUAAAAgAAAAAQAAAAEAAAAQAAAAAAAAAAAAAABRAQAAoAAAAAAAAAAAAAAAUQEAAKAAAABSAAAAcAEAAAIAAAAUAAAACQAAAAAAAAAAAAAAvAIAAAAAAAABAgIiUwB5AHMAdABlAG0AAAAAAAAAAAAAAAAAAAAAAAAAAAAAAAAAAAAAAAAAAAAAAAAAAAAAAAAAAAAAAAAAAAAAAAAAAAAAAAAAAAAAAAAAAAAAAAAAAAAAAAAAAAAAAAAAAAAAAAAAAAAAAAAAAAAAAAAAAAAAAAAAAAAAAAAAAAAAAAAAAAAAAAAAAAAAAAAAAAAAAAAAAAAAAAAAAAAAAAAAAAAAAAAAAAAAAAAAAAAAAAAAAAAAAAAAAAAAAAAAAAAAAAAAAAAAAAAAAAAAAAAAAAAAAAAAAAAAAAAAAAAAAAAAAAAAAAAAAAAAAAAAAAAAAAAAAAAAAAAAAAAAAAAAAAAAAAAAAAAAAAAAAAAAAAAAAAAAAAAAAAAAAAAAAAAAAAAAAAAAAAAAAAAAAAAAAAAAAAAAAAAAAAAAAABkdgAIAAAAACUAAAAMAAAAAgAAACcAAAAYAAAAAwAAAAAAAAAAAAAAAAAAACUAAAAMAAAAAwAAAEwAAABkAAAAAAAAAAAAAAD//////////wAAAAAcAAAAAAAAAD8AAAAhAPAAAAAAAAAAAAAAAIA/AAAAAAAAAAAAAIA/AAAAAAAAAAAAAAAAAAAAAAAAAAAAAAAAAAAAAAAAAAAlAAAADAAAAAAAAIAoAAAADAAAAAMAAAAnAAAAGAAAAAMAAAAAAAAAAAAAAAAAAAAlAAAADAAAAAMAAABMAAAAZAAAAAAAAAAAAAAA//////////8AAAAAHAAAAEABAAAAAAAAIQDwAAAAAAAAAAAAAACAPwAAAAAAAAAAAACAPwAAAAAAAAAAAAAAAAAAAAAAAAAAAAAAAAAAAAAAAAAAJQAAAAwAAAAAAACAKAAAAAwAAAADAAAAJwAAABgAAAADAAAAAAAAAAAAAAAAAAAAJQAAAAwAAAADAAAATAAAAGQAAAAAAAAAAAAAAP//////////QAEAABwAAAAAAAAAPwAAACEA8AAAAAAAAAAAAAAAgD8AAAAAAAAAAAAAgD8AAAAAAAAAAAAAAAAAAAAAAAAAAAAAAAAAAAAAAAAAACUAAAAMAAAAAAAAgCgAAAAMAAAAAwAAACcAAAAYAAAAAwAAAAAAAAAAAAAAAAAAACUAAAAMAAAAAwAAAEwAAABkAAAAAAAAAFsAAAA/AQAAXAAAAAAAAABbAAAAQAEAAAIAAAAhAPAAAAAAAAAAAAAAAIA/AAAAAAAAAAAAAIA/AAAAAAAAAAAAAAAAAAAAAAAAAAAAAAAAAAAAAAAAAAAlAAAADAAAAAAAAIAoAAAADAAAAAMAAAAnAAAAGAAAAAMAAAAAAAAA////AAAAAAAlAAAADAAAAAMAAABMAAAAZAAAAAAAAAAcAAAAPwEAAFoAAAAAAAAAHAAAAEABAAA/AAAAIQDwAAAAAAAAAAAAAACAPwAAAAAAAAAAAACAPwAAAAAAAAAAAAAAAAAAAAAAAAAAAAAAAAAAAAAAAAAAJQAAAAwAAAAAAACAKAAAAAwAAAADAAAAJwAAABgAAAADAAAAAAAAAP///wAAAAAAJQAAAAwAAAADAAAATAAAAGQAAAALAAAANwAAACEAAABaAAAACwAAADcAAAAXAAAAJAAAACEA8AAAAAAAAAAAAAAAgD8AAAAAAAAAAAAAgD8AAAAAAAAAAAAAAAAAAAAAAAAAAAAAAAAAAAAAAAAAACUAAAAMAAAAAAAAgCgAAAAMAAAAAwAAAFIAAABwAQAAAwAAAOD///8AAAAAAAAAAAAAAACQAQAAAAAAAQAAAABhAHIAaQBhAGwAAAAAAAAAAAAAAAAAAAAAAAAAAAAAAAAAAAAAAAAAAAAAAAAAAAAAAAAAAAAAAAAAAAAAAAAAAAAAAAAAAAAAAAAAAAAAAAAAAAAAAAAAAAAAAAAAAAAAAAAAAAAAAAAAAAAAAAAAAAAAAAAAAAAAAAAAAAAAAAAAAAAAAAAAAAAAAAAAAAAAAAAAAAAAAAAAAAAAAAAAAAAAAAAAAAAAAAAAAAAAAAAAAAAAAAAAAAAAAAAAAAAAAAAAAAAAAAAAAAAAAAAAAAAAAAAAAAAAAAAAAAAAAAAAAAAAAAAAAAAAAAAAAAAAAAAAAAAAAAAAAAAAAAAAAAAAAAAAAAAAAAAAAAAAAAAAAAAAAAAAAAAAAAAAAAAAAAAAAAAAAAAAAAAAAAAAAAAAAAAAAAAAAAAAAAAAAGR2AAgAAAAAJQAAAAwAAAADAAAAGAAAAAwAAAAAAAAAEgAAAAwAAAABAAAAFgAAAAwAAAAIAAAAVAAAAFQAAAAMAAAANwAAACAAAABaAAAAAQAAAFVVj0EmtI9BDAAAAFsAAAABAAAATAAAAAQAAAALAAAANwAAACIAAABbAAAAUAAAAFgAAAAVAAAAFgAAAAwAAAAAAAAAJQAAAAwAAAACAAAAJwAAABgAAAAEAAAAAAAAAP///wAAAAAAJQAAAAwAAAAEAAAATAAAAGQAAAAwAAAAIAAAADQBAABaAAAAMAAAACAAAAAFAQAAOwAAACEA8AAAAAAAAAAAAAAAgD8AAAAAAAAAAAAAgD8AAAAAAAAAAAAAAAAAAAAAAAAAAAAAAAAAAAAAAAAAACUAAAAMAAAAAAAAgCgAAAAMAAAABAAAACcAAAAYAAAABAAAAAAAAAD///8AAAAAACUAAAAMAAAABAAAAEwAAABkAAAAMAAAACAAAAA0AQAAVgAAADAAAAAgAAAABQEAADcAAAAhAPAAAAAAAAAAAAAAAIA/AAAAAAAAAAAAAIA/AAAAAAAAAAAAAAAAAAAAAAAAAAAAAAAAAAAAAAAAAAAlAAAADAAAAAAAAIAoAAAADAAAAAQAAAAnAAAAGAAAAAQAAAAAAAAA////AAAAAAAlAAAADAAAAAQAAABMAAAAZAAAADAAAAA7AAAAuQAAAFYAAAAwAAAAOwAAAIoAAAAcAAAAIQDwAAAAAAAAAAAAAACAPwAAAAAAAAAAAACAPwAAAAAAAAAAAAAAAAAAAAAAAAAAAAAAAAAAAAAAAAAAJQAAAAwAAAAAAACAKAAAAAwAAAAEAAAAUgAAAHABAAAEAAAA7P///wAAAAAAAAAAAAAAAJABAAAAAAABAAAAAHMAZQBnAG8AZQAgAHUAaQAAAAAAAAAAAAAAAAAAAAAAAAAAAAAAAAAAAAAAAAAAAAAAAAAAAAAAAAAAAAAAAAAAAAAAAAAAAAAAAAAAAAAAAAAAAAAAAAAAAAAAAAAAAAAAAAAAAAAAAAAAAAAAAAAAAAAAAAAAAAAAAAAAAAAAAAAAAAAAAAAAAAAAAAAAAAAAAAAAAAAAAAAAAAAAAAAAAAAAAAAAAAAAAAAAAAAAAAAAAAAAAAAAAAAAAAAAAAAAAAAAAAAAAAAAAAAAAAAAAAAAAAAAAAAAAAAAAAAAAAAAAAAAAAAAAAAAAAAAAAAAAAAAAAAAAAAAAAAAAAAAAAAAAAAAAAAAAAAAAAAAAAAAAAAAAAAAAAAAAAAAAAAAAAAAAAAAAAAAAAAAAAAAAAAAAAAAAAAAAAAAAAAAZHYACAAAAAAlAAAADAAAAAQAAAAYAAAADAAAAAAAAAASAAAADAAAAAEAAAAeAAAAGAAAADAAAAA7AAAAugAAAFcAAAAlAAAADAAAAAQAAABUAAAAnAAAADEAAAA7AAAAuAAAAFYAAAABAAAAVVWPQSa0j0ExAAAAOwAAAA0AAABMAAAAAAAAAAAAAAAAAAAA//////////9oAAAASwBhAHIAYQBiAG8AIABNAGEAcwBvAGsAYQAAAAwAAAAKAAAABwAAAAoAAAAMAAAADAAAAAUAAAASAAAACgAAAAgAAAAMAAAACgAAAAoAAABLAAAAQAAAADAAAAAFAAAAIAAAAAEAAAABAAAAEAAAAAAAAAAAAAAAUQEAAKAAAAAAAAAAAAAAAFEBAACgAAAAJQAAAAwAAAACAAAAJwAAABgAAAAFAAAAAAAAAP///wAAAAAAJQAAAAwAAAAFAAAATAAAAGQAAAAAAAAAYQAAAFABAACbAAAAAAAAAGEAAABRAQAAOwAAACEA8AAAAAAAAAAAAAAAgD8AAAAAAAAAAAAAgD8AAAAAAAAAAAAAAAAAAAAAAAAAAAAAAAAAAAAAAAAAACUAAAAMAAAAAAAAgCgAAAAMAAAABQAAACcAAAAYAAAABQAAAAAAAAD///8AAAAAACUAAAAMAAAABQAAAEwAAABkAAAADgAAAGEAAAA/AQAAcQAAAA4AAABhAAAAMgEAABEAAAAhAPAAAAAAAAAAAAAAAIA/AAAAAAAAAAAAAIA/AAAAAAAAAAAAAAAAAAAAAAAAAAAAAAAAAAAAAAAAAAAlAAAADAAAAAAAAIAoAAAADAAAAAUAAAAlAAAADAAAAAEAAAAYAAAADAAAAAAAAAASAAAADAAAAAEAAAAeAAAAGAAAAA4AAABhAAAAQAEAAHIAAAAlAAAADAAAAAEAAABUAAAAhAAAAA8AAABhAAAARQAAAHEAAAABAAAAVVWPQSa0j0EPAAAAYQAAAAkAAABMAAAAAAAAAAAAAAAAAAAA//////////9gAAAAUwBpAGcAbgBhAHQAdQByAGUAAAAHAAAAAwAAAAgAAAAHAAAABwAAAAQAAAAHAAAABQAAAAcAAABLAAAAQAAAADAAAAAFAAAAIAAAAAEAAAABAAAAEAAAAAAAAAAAAAAAUQEAAKAAAAAAAAAAAAAAAFEBAACgAAAAJQAAAAwAAAACAAAAJwAAABgAAAAFAAAAAAAAAP///wAAAAAAJQAAAAwAAAAFAAAATAAAAGQAAAAOAAAAdgAAAD8BAACGAAAADgAAAHYAAAAyAQAAEQAAACEA8AAAAAAAAAAAAAAAgD8AAAAAAAAAAAAAgD8AAAAAAAAAAAAAAAAAAAAAAAAAAAAAAAAAAAAAAAAAACUAAAAMAAAAAAAAgCgAAAAMAAAABQAAACcAAAAYAAAABQAAAAAAAAD///8AAAAAACUAAAAMAAAABQAAAEwAAABkAAAADgAAAIsAAABCAQAAmwAAAA4AAACLAAAANQEAABEAAAAhAPAAAAAAAAAAAAAAAIA/AAAAAAAAAAAAAIA/AAAAAAAAAAAAAAAAAAAAAAAAAAAAAAAAAAAAAAAAAAAlAAAADAAAAAAAAIAoAAAADAAAAAUAAAAlAAAADAAAAAEAAAAYAAAADAAAAAAAAAASAAAADAAAAAEAAAAWAAAADAAAAAAAAABUAAAAaAEAAA8AAACLAAAAQQEAAJsAAAABAAAAVVWPQSa0j0EPAAAAiwAAAC8AAABMAAAABAAAAA4AAACLAAAAQwEAAJwAAACsAAAAUwBpAGcAbgBlAGQAIABiAHkAOgAgAGYANQA3ADQAMAA0ADYAZAAtADgAOQBmAGUALQA0ADQAMwAyAC0AOAA2ADkAZAAtAGIAMgA2ADgAMAAyADEAOABiADUAYQAzAAAABwAAAAMAAAAIAAAABwAAAAcAAAAIAAAABAAAAAgAAAAGAAAAAwAAAAQAAAAEAAAABwAAAAcAAAAHAAAABwAAAAcAAAAHAAAACAAAAAUAAAAHAAAABwAAAAQAAAAHAAAABQAAAAcAAAAHAAAABwAAAAcAAAAFAAAABwAAAAcAAAAHAAAACAAAAAUAAAAIAAAABwAAAAcAAAAHAAAABwAAAAcAAAAHAAAABwAAAAgAAAAHAAAABwAAAAcAAAAWAAAADAAAAAAAAAAlAAAADAAAAAIAAAAOAAAAFAAAAAAAAAAQAAAAFAAAAA==</Object>
+</Signature>
+</file>
+
 <file path=customXml/item1.xml><?xml version="1.0" encoding="utf-8"?>
+<?mso-contentType ?>
+<FormTemplates xmlns="http://schemas.microsoft.com/sharepoint/v3/contenttype/forms">
+  <Display>DocumentLibraryForm</Display>
+  <Edit>DocumentLibraryForm</Edit>
+  <New>DocumentLibraryForm</New>
+</FormTemplates>
+</file>
+
+<file path=customXml/item2.xml><?xml version="1.0" encoding="utf-8"?>
 <ct:contentTypeSchema xmlns:ct="http://schemas.microsoft.com/office/2006/metadata/contentType" xmlns:ma="http://schemas.microsoft.com/office/2006/metadata/properties/metaAttributes" ct:_="" ma:_="" ma:contentTypeName="Document" ma:contentTypeID="0x010100C0E6AB5134EB1F48BDC02E5481C039B5" ma:contentTypeVersion="11" ma:contentTypeDescription="Create a new document." ma:contentTypeScope="" ma:versionID="534b9c902e6d73dc01888420d6f564b3">
   <xsd:schema xmlns:xsd="http://www.w3.org/2001/XMLSchema" xmlns:xs="http://www.w3.org/2001/XMLSchema" xmlns:p="http://schemas.microsoft.com/office/2006/metadata/properties" xmlns:ns3="c76fba90-bd48-4e65-9fce-772627206c4f" targetNamespace="http://schemas.microsoft.com/office/2006/metadata/properties" ma:root="true" ma:fieldsID="004fb4e21aac4bf94d5df1368d873111" ns3:_="">
     <xsd:import namespace="c76fba90-bd48-4e65-9fce-772627206c4f"/>
@@ -2326,15 +2520,6 @@
 </ct:contentTypeSchema>
 </file>
 
-<file path=customXml/item2.xml><?xml version="1.0" encoding="utf-8"?>
-<?mso-contentType ?>
-<FormTemplates xmlns="http://schemas.microsoft.com/sharepoint/v3/contenttype/forms">
-  <Display>DocumentLibraryForm</Display>
-  <Edit>DocumentLibraryForm</Edit>
-  <New>DocumentLibraryForm</New>
-</FormTemplates>
-</file>
-
 <file path=customXml/item3.xml><?xml version="1.0" encoding="utf-8"?>
 <p:properties xmlns:p="http://schemas.microsoft.com/office/2006/metadata/properties" xmlns:xsi="http://www.w3.org/2001/XMLSchema-instance" xmlns:pc="http://schemas.microsoft.com/office/infopath/2007/PartnerControls">
   <documentManagement>
@@ -2344,6 +2529,14 @@
 </file>
 
 <file path=customXml/itemProps1.xml><?xml version="1.0" encoding="utf-8"?>
+<ds:datastoreItem xmlns:ds="http://schemas.openxmlformats.org/officeDocument/2006/customXml" ds:itemID="{150D7E1B-4F1F-41DA-94CC-B34696FA2053}">
+  <ds:schemaRefs>
+    <ds:schemaRef ds:uri="http://schemas.microsoft.com/sharepoint/v3/contenttype/forms"/>
+  </ds:schemaRefs>
+</ds:datastoreItem>
+</file>
+
+<file path=customXml/itemProps2.xml><?xml version="1.0" encoding="utf-8"?>
 <ds:datastoreItem xmlns:ds="http://schemas.openxmlformats.org/officeDocument/2006/customXml" ds:itemID="{44B3D7BC-DC27-4E40-9F94-5873E4437891}">
   <ds:schemaRefs>
     <ds:schemaRef ds:uri="http://schemas.microsoft.com/office/2006/metadata/contentType"/>
@@ -2361,14 +2554,6 @@
 </ds:datastoreItem>
 </file>
 
-<file path=customXml/itemProps2.xml><?xml version="1.0" encoding="utf-8"?>
-<ds:datastoreItem xmlns:ds="http://schemas.openxmlformats.org/officeDocument/2006/customXml" ds:itemID="{150D7E1B-4F1F-41DA-94CC-B34696FA2053}">
-  <ds:schemaRefs>
-    <ds:schemaRef ds:uri="http://schemas.microsoft.com/sharepoint/v3/contenttype/forms"/>
-  </ds:schemaRefs>
-</ds:datastoreItem>
-</file>
-
 <file path=customXml/itemProps3.xml><?xml version="1.0" encoding="utf-8"?>
 <ds:datastoreItem xmlns:ds="http://schemas.openxmlformats.org/officeDocument/2006/customXml" ds:itemID="{67B89194-640F-4DC2-878A-AA227FF81D19}">
   <ds:schemaRefs>

</xml_diff>

<commit_message>
Fixed and Added AI declaration
</commit_message>
<xml_diff>
--- a/docs/declarations/templates/AI DECLARATION.docx
+++ b/docs/declarations/templates/AI DECLARATION.docx
@@ -1,6 +1,6 @@
 
 <file path=word/document.xml><?xml version="1.0" encoding="utf-8"?>
-<w:document xmlns:wpc="http://schemas.microsoft.com/office/word/2010/wordprocessingCanvas" xmlns:cx="http://schemas.microsoft.com/office/drawing/2014/chartex" xmlns:cx1="http://schemas.microsoft.com/office/drawing/2015/9/8/chartex" xmlns:cx2="http://schemas.microsoft.com/office/drawing/2015/10/21/chartex" xmlns:cx3="http://schemas.microsoft.com/office/drawing/2016/5/9/chartex" xmlns:cx4="http://schemas.microsoft.com/office/drawing/2016/5/10/chartex" xmlns:cx5="http://schemas.microsoft.com/office/drawing/2016/5/11/chartex" xmlns:cx6="http://schemas.microsoft.com/office/drawing/2016/5/12/chartex" xmlns:cx7="http://schemas.microsoft.com/office/drawing/2016/5/13/chartex" xmlns:cx8="http://schemas.microsoft.com/office/drawing/2016/5/14/chartex" xmlns:mc="http://schemas.openxmlformats.org/markup-compatibility/2006" xmlns:aink="http://schemas.microsoft.com/office/drawing/2016/ink" xmlns:am3d="http://schemas.microsoft.com/office/drawing/2017/model3d" xmlns:o="urn:schemas-microsoft-com:office:office" xmlns:oel="http://schemas.microsoft.com/office/2019/extlst" xmlns:r="http://schemas.openxmlformats.org/officeDocument/2006/relationships" xmlns:m="http://schemas.openxmlformats.org/officeDocument/2006/math" xmlns:v="urn:schemas-microsoft-com:vml" xmlns:wp14="http://schemas.microsoft.com/office/word/2010/wordprocessingDrawing" xmlns:wp="http://schemas.openxmlformats.org/drawingml/2006/wordprocessingDrawing" xmlns:w10="urn:schemas-microsoft-com:office:word" xmlns:w="http://schemas.openxmlformats.org/wordprocessingml/2006/main" xmlns:w14="http://schemas.microsoft.com/office/word/2010/wordml" xmlns:w15="http://schemas.microsoft.com/office/word/2012/wordml" xmlns:w16cex="http://schemas.microsoft.com/office/word/2018/wordml/cex" xmlns:w16cid="http://schemas.microsoft.com/office/word/2016/wordml/cid" xmlns:w16="http://schemas.microsoft.com/office/word/2018/wordml" xmlns:w16du="http://schemas.microsoft.com/office/word/2023/wordml/word16du" xmlns:w16sdtdh="http://schemas.microsoft.com/office/word/2020/wordml/sdtdatahash" xmlns:w16sdtfl="http://schemas.microsoft.com/office/word/2024/wordml/sdtformatlock" xmlns:w16se="http://schemas.microsoft.com/office/word/2015/wordml/symex" xmlns:wpg="http://schemas.microsoft.com/office/word/2010/wordprocessingGroup" xmlns:wpi="http://schemas.microsoft.com/office/word/2010/wordprocessingInk" xmlns:wne="http://schemas.microsoft.com/office/word/2006/wordml" xmlns:wps="http://schemas.microsoft.com/office/word/2010/wordprocessingShape" mc:Ignorable="w14 w15 w16se w16cid w16 w16cex w16sdtdh w16sdtfl w16du wp14">
+<w:document xmlns:wpc="http://schemas.microsoft.com/office/word/2010/wordprocessingCanvas" xmlns:cx="http://schemas.microsoft.com/office/drawing/2014/chartex" xmlns:mc="http://schemas.openxmlformats.org/markup-compatibility/2006" xmlns:o="urn:schemas-microsoft-com:office:office" xmlns:r="http://schemas.openxmlformats.org/officeDocument/2006/relationships" xmlns:m="http://schemas.openxmlformats.org/officeDocument/2006/math" xmlns:v="urn:schemas-microsoft-com:vml" xmlns:wp14="http://schemas.microsoft.com/office/word/2010/wordprocessingDrawing" xmlns:wp="http://schemas.openxmlformats.org/drawingml/2006/wordprocessingDrawing" xmlns:w10="urn:schemas-microsoft-com:office:word" xmlns:w="http://schemas.openxmlformats.org/wordprocessingml/2006/main" xmlns:w14="http://schemas.microsoft.com/office/word/2010/wordml" xmlns:w15="http://schemas.microsoft.com/office/word/2012/wordml" xmlns:w16se="http://schemas.microsoft.com/office/word/2015/wordml/symex" xmlns:wpg="http://schemas.microsoft.com/office/word/2010/wordprocessingGroup" xmlns:wpi="http://schemas.microsoft.com/office/word/2010/wordprocessingInk" xmlns:wne="http://schemas.microsoft.com/office/word/2006/wordml" xmlns:wps="http://schemas.microsoft.com/office/word/2010/wordprocessingShape" mc:Ignorable="w14 w15 w16se wp14">
   <w:body>
     <w:p>
       <w:pPr>
@@ -64,14 +64,11 @@
           <w:placeholder>
             <w:docPart w:val="DefaultPlaceholder_-1854013440"/>
           </w:placeholder>
-          <w:showingPlcHdr/>
         </w:sdtPr>
+        <w:sdtEndPr/>
         <w:sdtContent>
           <w:r>
-            <w:rPr>
-              <w:rStyle w:val="PlaceholderText"/>
-            </w:rPr>
-            <w:t>Click or tap here to enter text.</w:t>
+            <w:t>docs/</w:t>
           </w:r>
         </w:sdtContent>
       </w:sdt>
@@ -96,14 +93,11 @@
           <w:placeholder>
             <w:docPart w:val="DefaultPlaceholder_-1854013440"/>
           </w:placeholder>
-          <w:showingPlcHdr/>
         </w:sdtPr>
+        <w:sdtEndPr/>
         <w:sdtContent>
           <w:r>
-            <w:rPr>
-              <w:rStyle w:val="PlaceholderText"/>
-            </w:rPr>
-            <w:t>Click or tap here to enter text.</w:t>
+            <w:t>Jimmy Junior Baloyi</w:t>
           </w:r>
         </w:sdtContent>
       </w:sdt>
@@ -128,14 +122,11 @@
           <w:placeholder>
             <w:docPart w:val="DefaultPlaceholder_-1854013440"/>
           </w:placeholder>
-          <w:showingPlcHdr/>
         </w:sdtPr>
+        <w:sdtEndPr/>
         <w:sdtContent>
           <w:r>
-            <w:rPr>
-              <w:rStyle w:val="PlaceholderText"/>
-            </w:rPr>
-            <w:t>Click or tap here to enter text.</w:t>
+            <w:t>601713</w:t>
           </w:r>
         </w:sdtContent>
       </w:sdt>
@@ -189,14 +180,15 @@
           <w:placeholder>
             <w:docPart w:val="DefaultPlaceholder_-1854013440"/>
           </w:placeholder>
-          <w:showingPlcHdr/>
         </w:sdtPr>
+        <w:sdtEndPr/>
         <w:sdtContent>
           <w:r>
             <w:rPr>
-              <w:rStyle w:val="PlaceholderText"/>
+              <w:b/>
+              <w:bCs/>
             </w:rPr>
-            <w:t>Click or tap here to enter text.</w:t>
+            <w:t>03</w:t>
           </w:r>
         </w:sdtContent>
       </w:sdt>
@@ -237,17 +229,18 @@
         <w:sdtPr>
           <w:id w:val="677935703"/>
           <w14:checkbox>
-            <w14:checked w14:val="0"/>
+            <w14:checked w14:val="1"/>
             <w14:checkedState w14:val="2612" w14:font="MS Gothic"/>
             <w14:uncheckedState w14:val="2610" w14:font="MS Gothic"/>
           </w14:checkbox>
         </w:sdtPr>
+        <w:sdtEndPr/>
         <w:sdtContent>
           <w:r>
             <w:rPr>
               <w:rFonts w:ascii="MS Gothic" w:eastAsia="MS Gothic" w:hAnsi="MS Gothic" w:hint="eastAsia"/>
             </w:rPr>
-            <w:t>☐</w:t>
+            <w:t>☒</w:t>
           </w:r>
         </w:sdtContent>
       </w:sdt>
@@ -301,14 +294,11 @@
           <w:placeholder>
             <w:docPart w:val="DefaultPlaceholder_-1854013440"/>
           </w:placeholder>
-          <w:showingPlcHdr/>
         </w:sdtPr>
+        <w:sdtEndPr/>
         <w:sdtContent>
           <w:r>
-            <w:rPr>
-              <w:rStyle w:val="PlaceholderText"/>
-            </w:rPr>
-            <w:t>Click or tap here to enter text.</w:t>
+            <w:t>Jimmy Junior Baloyi</w:t>
           </w:r>
         </w:sdtContent>
       </w:sdt>
@@ -333,20 +323,17 @@
           <w:placeholder>
             <w:docPart w:val="DefaultPlaceholder_-1854013437"/>
           </w:placeholder>
-          <w:showingPlcHdr/>
-          <w:date>
+          <w:date w:fullDate="2026-09-09T00:00:00Z">
             <w:dateFormat w:val="yyyy/MM/dd"/>
             <w:lid w:val="en-ZA"/>
             <w:storeMappedDataAs w:val="dateTime"/>
             <w:calendar w:val="gregorian"/>
           </w:date>
         </w:sdtPr>
+        <w:sdtEndPr/>
         <w:sdtContent>
           <w:r>
-            <w:rPr>
-              <w:rStyle w:val="PlaceholderText"/>
-            </w:rPr>
-            <w:t>Click or tap to enter a date.</w:t>
+            <w:t>2026/09/09</w:t>
           </w:r>
         </w:sdtContent>
       </w:sdt>
@@ -362,7 +349,7 @@
 </file>
 
 <file path=word/styles.xml><?xml version="1.0" encoding="utf-8"?>
-<w:styles xmlns:mc="http://schemas.openxmlformats.org/markup-compatibility/2006" xmlns:r="http://schemas.openxmlformats.org/officeDocument/2006/relationships" xmlns:w="http://schemas.openxmlformats.org/wordprocessingml/2006/main" xmlns:w14="http://schemas.microsoft.com/office/word/2010/wordml" xmlns:w15="http://schemas.microsoft.com/office/word/2012/wordml" xmlns:w16cex="http://schemas.microsoft.com/office/word/2018/wordml/cex" xmlns:w16cid="http://schemas.microsoft.com/office/word/2016/wordml/cid" xmlns:w16="http://schemas.microsoft.com/office/word/2018/wordml" xmlns:w16du="http://schemas.microsoft.com/office/word/2023/wordml/word16du" xmlns:w16sdtdh="http://schemas.microsoft.com/office/word/2020/wordml/sdtdatahash" xmlns:w16sdtfl="http://schemas.microsoft.com/office/word/2024/wordml/sdtformatlock" xmlns:w16se="http://schemas.microsoft.com/office/word/2015/wordml/symex" mc:Ignorable="w14 w15 w16se w16cid w16 w16cex w16sdtdh w16sdtfl w16du">
+<w:styles xmlns:mc="http://schemas.openxmlformats.org/markup-compatibility/2006" xmlns:r="http://schemas.openxmlformats.org/officeDocument/2006/relationships" xmlns:w="http://schemas.openxmlformats.org/wordprocessingml/2006/main" xmlns:w14="http://schemas.microsoft.com/office/word/2010/wordml" xmlns:w15="http://schemas.microsoft.com/office/word/2012/wordml" xmlns:w16se="http://schemas.microsoft.com/office/word/2015/wordml/symex" mc:Ignorable="w14 w15 w16se">
   <w:docDefaults>
     <w:rPrDefault>
       <w:rPr>
@@ -380,7 +367,7 @@
       </w:pPr>
     </w:pPrDefault>
   </w:docDefaults>
-  <w:latentStyles w:defLockedState="0" w:defUIPriority="99" w:defSemiHidden="0" w:defUnhideWhenUsed="0" w:defQFormat="0" w:count="376">
+  <w:latentStyles w:defLockedState="0" w:defUIPriority="99" w:defSemiHidden="0" w:defUnhideWhenUsed="0" w:defQFormat="0" w:count="371">
     <w:lsdException w:name="Normal" w:uiPriority="0" w:qFormat="1"/>
     <w:lsdException w:name="heading 1" w:uiPriority="9" w:qFormat="1"/>
     <w:lsdException w:name="heading 2" w:semiHidden="1" w:uiPriority="9" w:unhideWhenUsed="1" w:qFormat="1"/>
@@ -752,11 +739,6 @@
     <w:lsdException w:name="List Table 5 Dark Accent 6" w:uiPriority="50"/>
     <w:lsdException w:name="List Table 6 Colorful Accent 6" w:uiPriority="51"/>
     <w:lsdException w:name="List Table 7 Colorful Accent 6" w:uiPriority="52"/>
-    <w:lsdException w:name="Mention" w:semiHidden="1" w:unhideWhenUsed="1"/>
-    <w:lsdException w:name="Smart Hyperlink" w:semiHidden="1" w:unhideWhenUsed="1"/>
-    <w:lsdException w:name="Hashtag" w:semiHidden="1" w:unhideWhenUsed="1"/>
-    <w:lsdException w:name="Unresolved Mention" w:semiHidden="1" w:unhideWhenUsed="1"/>
-    <w:lsdException w:name="Smart Link" w:semiHidden="1" w:unhideWhenUsed="1"/>
   </w:latentStyles>
   <w:style w:type="paragraph" w:default="1" w:styleId="Normal">
     <w:name w:val="Normal"/>
@@ -1292,7 +1274,7 @@
 </file>
 
 <file path=word/glossary/document.xml><?xml version="1.0" encoding="utf-8"?>
-<w:glossaryDocument xmlns:wpc="http://schemas.microsoft.com/office/word/2010/wordprocessingCanvas" xmlns:cx="http://schemas.microsoft.com/office/drawing/2014/chartex" xmlns:cx1="http://schemas.microsoft.com/office/drawing/2015/9/8/chartex" xmlns:cx2="http://schemas.microsoft.com/office/drawing/2015/10/21/chartex" xmlns:cx3="http://schemas.microsoft.com/office/drawing/2016/5/9/chartex" xmlns:cx4="http://schemas.microsoft.com/office/drawing/2016/5/10/chartex" xmlns:cx5="http://schemas.microsoft.com/office/drawing/2016/5/11/chartex" xmlns:cx6="http://schemas.microsoft.com/office/drawing/2016/5/12/chartex" xmlns:cx7="http://schemas.microsoft.com/office/drawing/2016/5/13/chartex" xmlns:cx8="http://schemas.microsoft.com/office/drawing/2016/5/14/chartex" xmlns:mc="http://schemas.openxmlformats.org/markup-compatibility/2006" xmlns:aink="http://schemas.microsoft.com/office/drawing/2016/ink" xmlns:am3d="http://schemas.microsoft.com/office/drawing/2017/model3d" xmlns:o="urn:schemas-microsoft-com:office:office" xmlns:oel="http://schemas.microsoft.com/office/2019/extlst" xmlns:r="http://schemas.openxmlformats.org/officeDocument/2006/relationships" xmlns:m="http://schemas.openxmlformats.org/officeDocument/2006/math" xmlns:v="urn:schemas-microsoft-com:vml" xmlns:wp14="http://schemas.microsoft.com/office/word/2010/wordprocessingDrawing" xmlns:wp="http://schemas.openxmlformats.org/drawingml/2006/wordprocessingDrawing" xmlns:w10="urn:schemas-microsoft-com:office:word" xmlns:w="http://schemas.openxmlformats.org/wordprocessingml/2006/main" xmlns:w14="http://schemas.microsoft.com/office/word/2010/wordml" xmlns:w15="http://schemas.microsoft.com/office/word/2012/wordml" xmlns:w16cex="http://schemas.microsoft.com/office/word/2018/wordml/cex" xmlns:w16cid="http://schemas.microsoft.com/office/word/2016/wordml/cid" xmlns:w16="http://schemas.microsoft.com/office/word/2018/wordml" xmlns:w16du="http://schemas.microsoft.com/office/word/2023/wordml/word16du" xmlns:w16sdtdh="http://schemas.microsoft.com/office/word/2020/wordml/sdtdatahash" xmlns:w16sdtfl="http://schemas.microsoft.com/office/word/2024/wordml/sdtformatlock" xmlns:w16se="http://schemas.microsoft.com/office/word/2015/wordml/symex" xmlns:wpg="http://schemas.microsoft.com/office/word/2010/wordprocessingGroup" xmlns:wpi="http://schemas.microsoft.com/office/word/2010/wordprocessingInk" xmlns:wne="http://schemas.microsoft.com/office/word/2006/wordml" xmlns:wps="http://schemas.microsoft.com/office/word/2010/wordprocessingShape" mc:Ignorable="w14 w15 w16se w16cid w16 w16cex w16sdtdh w16sdtfl w16du wp14">
+<w:glossaryDocument xmlns:wpc="http://schemas.microsoft.com/office/word/2010/wordprocessingCanvas" xmlns:cx="http://schemas.microsoft.com/office/drawing/2014/chartex" xmlns:mc="http://schemas.openxmlformats.org/markup-compatibility/2006" xmlns:o="urn:schemas-microsoft-com:office:office" xmlns:r="http://schemas.openxmlformats.org/officeDocument/2006/relationships" xmlns:m="http://schemas.openxmlformats.org/officeDocument/2006/math" xmlns:v="urn:schemas-microsoft-com:vml" xmlns:wp14="http://schemas.microsoft.com/office/word/2010/wordprocessingDrawing" xmlns:wp="http://schemas.openxmlformats.org/drawingml/2006/wordprocessingDrawing" xmlns:w10="urn:schemas-microsoft-com:office:word" xmlns:w="http://schemas.openxmlformats.org/wordprocessingml/2006/main" xmlns:w14="http://schemas.microsoft.com/office/word/2010/wordml" xmlns:w15="http://schemas.microsoft.com/office/word/2012/wordml" xmlns:w16se="http://schemas.microsoft.com/office/word/2015/wordml/symex" xmlns:wpg="http://schemas.microsoft.com/office/word/2010/wordprocessingGroup" xmlns:wpi="http://schemas.microsoft.com/office/word/2010/wordprocessingInk" xmlns:wne="http://schemas.microsoft.com/office/word/2006/wordml" xmlns:wps="http://schemas.microsoft.com/office/word/2010/wordprocessingShape" mc:Ignorable="w14 w15 w16se wp14">
   <w:docParts>
     <w:docPart>
       <w:docPartPr>
@@ -1351,12 +1333,13 @@
 </file>
 
 <file path=word/glossary/fontTable.xml><?xml version="1.0" encoding="utf-8"?>
-<w:fonts xmlns:mc="http://schemas.openxmlformats.org/markup-compatibility/2006" xmlns:r="http://schemas.openxmlformats.org/officeDocument/2006/relationships" xmlns:w="http://schemas.openxmlformats.org/wordprocessingml/2006/main" xmlns:w14="http://schemas.microsoft.com/office/word/2010/wordml" xmlns:w15="http://schemas.microsoft.com/office/word/2012/wordml" xmlns:w16cex="http://schemas.microsoft.com/office/word/2018/wordml/cex" xmlns:w16cid="http://schemas.microsoft.com/office/word/2016/wordml/cid" xmlns:w16="http://schemas.microsoft.com/office/word/2018/wordml" xmlns:w16du="http://schemas.microsoft.com/office/word/2023/wordml/word16du" xmlns:w16sdtdh="http://schemas.microsoft.com/office/word/2020/wordml/sdtdatahash" xmlns:w16sdtfl="http://schemas.microsoft.com/office/word/2024/wordml/sdtformatlock" xmlns:w16se="http://schemas.microsoft.com/office/word/2015/wordml/symex" mc:Ignorable="w14 w15 w16se w16cid w16 w16cex w16sdtdh w16sdtfl w16du">
+<w:fonts xmlns:mc="http://schemas.openxmlformats.org/markup-compatibility/2006" xmlns:r="http://schemas.openxmlformats.org/officeDocument/2006/relationships" xmlns:w="http://schemas.openxmlformats.org/wordprocessingml/2006/main" xmlns:w14="http://schemas.microsoft.com/office/word/2010/wordml" xmlns:w15="http://schemas.microsoft.com/office/word/2012/wordml" xmlns:w16se="http://schemas.microsoft.com/office/word/2015/wordml/symex" mc:Ignorable="w14 w15 w16se">
   <w:font w:name="Aptos">
+    <w:altName w:val="Arial"/>
     <w:charset w:val="00"/>
     <w:family w:val="swiss"/>
     <w:pitch w:val="variable"/>
-    <w:sig w:usb0="20000287" w:usb1="00000003" w:usb2="00000000" w:usb3="00000000" w:csb0="0000019F" w:csb1="00000000"/>
+    <w:sig w:usb0="00000001" w:usb1="00000003" w:usb2="00000000" w:usb3="00000000" w:csb0="0000019F" w:csb1="00000000"/>
   </w:font>
   <w:font w:name="Times New Roman">
     <w:panose1 w:val="02020603050405020304"/>
@@ -1366,10 +1349,11 @@
     <w:sig w:usb0="E0002EFF" w:usb1="C000785B" w:usb2="00000009" w:usb3="00000000" w:csb0="000001FF" w:csb1="00000000"/>
   </w:font>
   <w:font w:name="Aptos Display">
+    <w:altName w:val="Arial"/>
     <w:charset w:val="00"/>
     <w:family w:val="swiss"/>
     <w:pitch w:val="variable"/>
-    <w:sig w:usb0="20000287" w:usb1="00000003" w:usb2="00000000" w:usb3="00000000" w:csb0="0000019F" w:csb1="00000000"/>
+    <w:sig w:usb0="00000001" w:usb1="00000003" w:usb2="00000000" w:usb3="00000000" w:csb0="0000019F" w:csb1="00000000"/>
   </w:font>
   <w:font w:name="MS Gothic">
     <w:altName w:val="ＭＳ ゴシック"/>
@@ -1379,11 +1363,25 @@
     <w:pitch w:val="fixed"/>
     <w:sig w:usb0="E00002FF" w:usb1="6AC7FDFB" w:usb2="08000012" w:usb3="00000000" w:csb0="0002009F" w:csb1="00000000"/>
   </w:font>
+  <w:font w:name="Calibri">
+    <w:panose1 w:val="020F0502020204030204"/>
+    <w:charset w:val="00"/>
+    <w:family w:val="swiss"/>
+    <w:pitch w:val="variable"/>
+    <w:sig w:usb0="E4002EFF" w:usb1="C200247B" w:usb2="00000009" w:usb3="00000000" w:csb0="000001FF" w:csb1="00000000"/>
+  </w:font>
+  <w:font w:name="Calibri Light">
+    <w:panose1 w:val="020F0302020204030204"/>
+    <w:charset w:val="00"/>
+    <w:family w:val="swiss"/>
+    <w:pitch w:val="variable"/>
+    <w:sig w:usb0="E4002EFF" w:usb1="C200247B" w:usb2="00000009" w:usb3="00000000" w:csb0="000001FF" w:csb1="00000000"/>
+  </w:font>
 </w:fonts>
 </file>
 
 <file path=word/glossary/settings.xml><?xml version="1.0" encoding="utf-8"?>
-<w:settings xmlns:mc="http://schemas.openxmlformats.org/markup-compatibility/2006" xmlns:o="urn:schemas-microsoft-com:office:office" xmlns:r="http://schemas.openxmlformats.org/officeDocument/2006/relationships" xmlns:m="http://schemas.openxmlformats.org/officeDocument/2006/math" xmlns:v="urn:schemas-microsoft-com:vml" xmlns:w10="urn:schemas-microsoft-com:office:word" xmlns:w="http://schemas.openxmlformats.org/wordprocessingml/2006/main" xmlns:w14="http://schemas.microsoft.com/office/word/2010/wordml" xmlns:w15="http://schemas.microsoft.com/office/word/2012/wordml" xmlns:w16cex="http://schemas.microsoft.com/office/word/2018/wordml/cex" xmlns:w16cid="http://schemas.microsoft.com/office/word/2016/wordml/cid" xmlns:w16="http://schemas.microsoft.com/office/word/2018/wordml" xmlns:w16du="http://schemas.microsoft.com/office/word/2023/wordml/word16du" xmlns:w16sdtdh="http://schemas.microsoft.com/office/word/2020/wordml/sdtdatahash" xmlns:w16sdtfl="http://schemas.microsoft.com/office/word/2024/wordml/sdtformatlock" xmlns:w16se="http://schemas.microsoft.com/office/word/2015/wordml/symex" xmlns:sl="http://schemas.openxmlformats.org/schemaLibrary/2006/main" mc:Ignorable="w14 w15 w16se w16cid w16 w16cex w16sdtdh w16sdtfl w16du">
+<w:settings xmlns:mc="http://schemas.openxmlformats.org/markup-compatibility/2006" xmlns:o="urn:schemas-microsoft-com:office:office" xmlns:r="http://schemas.openxmlformats.org/officeDocument/2006/relationships" xmlns:m="http://schemas.openxmlformats.org/officeDocument/2006/math" xmlns:v="urn:schemas-microsoft-com:vml" xmlns:w10="urn:schemas-microsoft-com:office:word" xmlns:w="http://schemas.openxmlformats.org/wordprocessingml/2006/main" xmlns:w14="http://schemas.microsoft.com/office/word/2010/wordml" xmlns:w15="http://schemas.microsoft.com/office/word/2012/wordml" xmlns:w16se="http://schemas.microsoft.com/office/word/2015/wordml/symex" xmlns:sl="http://schemas.openxmlformats.org/schemaLibrary/2006/main" mc:Ignorable="w14 w15 w16se">
   <w:view w:val="normal"/>
   <w:defaultTabStop w:val="720"/>
   <w:characterSpacingControl w:val="doNotCompress"/>
@@ -1394,12 +1392,12 @@
     <w:compatSetting w:name="enableOpenTypeFeatures" w:uri="http://schemas.microsoft.com/office/word" w:val="1"/>
     <w:compatSetting w:name="doNotFlipMirrorIndents" w:uri="http://schemas.microsoft.com/office/word" w:val="1"/>
     <w:compatSetting w:name="differentiateMultirowTableHeaders" w:uri="http://schemas.microsoft.com/office/word" w:val="1"/>
-    <w:compatSetting w:name="useWord2013TrackBottomHyphenation" w:uri="http://schemas.microsoft.com/office/word" w:val="0"/>
   </w:compat>
   <w:rsids>
     <w:rsidRoot w:val="006573DA"/>
     <w:rsid w:val="003D50F4"/>
     <w:rsid w:val="006573DA"/>
+    <w:rsid w:val="00B958DB"/>
     <w:rsid w:val="00CD62E1"/>
     <w:rsid w:val="00E063BC"/>
     <w:rsid w:val="00F509BB"/>
@@ -1426,7 +1424,7 @@
 </file>
 
 <file path=word/glossary/styles.xml><?xml version="1.0" encoding="utf-8"?>
-<w:styles xmlns:mc="http://schemas.openxmlformats.org/markup-compatibility/2006" xmlns:r="http://schemas.openxmlformats.org/officeDocument/2006/relationships" xmlns:w="http://schemas.openxmlformats.org/wordprocessingml/2006/main" xmlns:w14="http://schemas.microsoft.com/office/word/2010/wordml" xmlns:w15="http://schemas.microsoft.com/office/word/2012/wordml" xmlns:w16cex="http://schemas.microsoft.com/office/word/2018/wordml/cex" xmlns:w16cid="http://schemas.microsoft.com/office/word/2016/wordml/cid" xmlns:w16="http://schemas.microsoft.com/office/word/2018/wordml" xmlns:w16du="http://schemas.microsoft.com/office/word/2023/wordml/word16du" xmlns:w16sdtdh="http://schemas.microsoft.com/office/word/2020/wordml/sdtdatahash" xmlns:w16sdtfl="http://schemas.microsoft.com/office/word/2024/wordml/sdtformatlock" xmlns:w16se="http://schemas.microsoft.com/office/word/2015/wordml/symex" mc:Ignorable="w14 w15 w16se w16cid w16 w16cex w16sdtdh w16sdtfl w16du">
+<w:styles xmlns:mc="http://schemas.openxmlformats.org/markup-compatibility/2006" xmlns:r="http://schemas.openxmlformats.org/officeDocument/2006/relationships" xmlns:w="http://schemas.openxmlformats.org/wordprocessingml/2006/main" xmlns:w14="http://schemas.microsoft.com/office/word/2010/wordml" xmlns:w15="http://schemas.microsoft.com/office/word/2012/wordml" xmlns:w16se="http://schemas.microsoft.com/office/word/2015/wordml/symex" mc:Ignorable="w14 w15 w16se">
   <w:docDefaults>
     <w:rPrDefault>
       <w:rPr>
@@ -1444,7 +1442,7 @@
       </w:pPr>
     </w:pPrDefault>
   </w:docDefaults>
-  <w:latentStyles w:defLockedState="0" w:defUIPriority="99" w:defSemiHidden="0" w:defUnhideWhenUsed="0" w:defQFormat="0" w:count="376">
+  <w:latentStyles w:defLockedState="0" w:defUIPriority="99" w:defSemiHidden="0" w:defUnhideWhenUsed="0" w:defQFormat="0" w:count="371">
     <w:lsdException w:name="Normal" w:uiPriority="0" w:qFormat="1"/>
     <w:lsdException w:name="heading 1" w:uiPriority="9" w:qFormat="1"/>
     <w:lsdException w:name="heading 2" w:semiHidden="1" w:uiPriority="9" w:unhideWhenUsed="1" w:qFormat="1"/>
@@ -1816,11 +1814,6 @@
     <w:lsdException w:name="List Table 5 Dark Accent 6" w:uiPriority="50"/>
     <w:lsdException w:name="List Table 6 Colorful Accent 6" w:uiPriority="51"/>
     <w:lsdException w:name="List Table 7 Colorful Accent 6" w:uiPriority="52"/>
-    <w:lsdException w:name="Mention" w:semiHidden="1" w:unhideWhenUsed="1"/>
-    <w:lsdException w:name="Smart Hyperlink" w:semiHidden="1" w:unhideWhenUsed="1"/>
-    <w:lsdException w:name="Hashtag" w:semiHidden="1" w:unhideWhenUsed="1"/>
-    <w:lsdException w:name="Unresolved Mention" w:semiHidden="1" w:unhideWhenUsed="1"/>
-    <w:lsdException w:name="Smart Link" w:semiHidden="1" w:unhideWhenUsed="1"/>
   </w:latentStyles>
   <w:style w:type="paragraph" w:default="1" w:styleId="Normal">
     <w:name w:val="Normal"/>
@@ -1867,7 +1860,7 @@
 </file>
 
 <file path=word/glossary/webSettings.xml><?xml version="1.0" encoding="utf-8"?>
-<w:webSettings xmlns:mc="http://schemas.openxmlformats.org/markup-compatibility/2006" xmlns:r="http://schemas.openxmlformats.org/officeDocument/2006/relationships" xmlns:w="http://schemas.openxmlformats.org/wordprocessingml/2006/main" xmlns:w14="http://schemas.microsoft.com/office/word/2010/wordml" xmlns:w15="http://schemas.microsoft.com/office/word/2012/wordml" xmlns:w16cex="http://schemas.microsoft.com/office/word/2018/wordml/cex" xmlns:w16cid="http://schemas.microsoft.com/office/word/2016/wordml/cid" xmlns:w16="http://schemas.microsoft.com/office/word/2018/wordml" xmlns:w16du="http://schemas.microsoft.com/office/word/2023/wordml/word16du" xmlns:w16sdtdh="http://schemas.microsoft.com/office/word/2020/wordml/sdtdatahash" xmlns:w16sdtfl="http://schemas.microsoft.com/office/word/2024/wordml/sdtformatlock" xmlns:w16se="http://schemas.microsoft.com/office/word/2015/wordml/symex" mc:Ignorable="w14 w15 w16se w16cid w16 w16cex w16sdtdh w16sdtfl w16du">
+<w:webSettings xmlns:mc="http://schemas.openxmlformats.org/markup-compatibility/2006" xmlns:r="http://schemas.openxmlformats.org/officeDocument/2006/relationships" xmlns:w="http://schemas.openxmlformats.org/wordprocessingml/2006/main" xmlns:w14="http://schemas.microsoft.com/office/word/2010/wordml" xmlns:w15="http://schemas.microsoft.com/office/word/2012/wordml" xmlns:w16se="http://schemas.microsoft.com/office/word/2015/wordml/symex" mc:Ignorable="w14 w15 w16se">
   <w:optimizeForBrowser/>
   <w:allowPNG/>
 </w:webSettings>
@@ -2169,23 +2162,6 @@
 </file>
 
 <file path=customXml/item1.xml><?xml version="1.0" encoding="utf-8"?>
-<p:properties xmlns:p="http://schemas.microsoft.com/office/2006/metadata/properties" xmlns:xsi="http://www.w3.org/2001/XMLSchema-instance" xmlns:pc="http://schemas.microsoft.com/office/infopath/2007/PartnerControls">
-  <documentManagement>
-    <_activity xmlns="c76fba90-bd48-4e65-9fce-772627206c4f" xsi:nil="true"/>
-  </documentManagement>
-</p:properties>
-</file>
-
-<file path=customXml/item2.xml><?xml version="1.0" encoding="utf-8"?>
-<?mso-contentType ?>
-<FormTemplates xmlns="http://schemas.microsoft.com/sharepoint/v3/contenttype/forms">
-  <Display>DocumentLibraryForm</Display>
-  <Edit>DocumentLibraryForm</Edit>
-  <New>DocumentLibraryForm</New>
-</FormTemplates>
-</file>
-
-<file path=customXml/item3.xml><?xml version="1.0" encoding="utf-8"?>
 <ct:contentTypeSchema xmlns:ct="http://schemas.microsoft.com/office/2006/metadata/contentType" xmlns:ma="http://schemas.microsoft.com/office/2006/metadata/properties/metaAttributes" ct:_="" ma:_="" ma:contentTypeName="Document" ma:contentTypeID="0x010100C0E6AB5134EB1F48BDC02E5481C039B5" ma:contentTypeVersion="11" ma:contentTypeDescription="Create a new document." ma:contentTypeScope="" ma:versionID="534b9c902e6d73dc01888420d6f564b3">
   <xsd:schema xmlns:xsd="http://www.w3.org/2001/XMLSchema" xmlns:xs="http://www.w3.org/2001/XMLSchema" xmlns:p="http://schemas.microsoft.com/office/2006/metadata/properties" xmlns:ns3="c76fba90-bd48-4e65-9fce-772627206c4f" targetNamespace="http://schemas.microsoft.com/office/2006/metadata/properties" ma:root="true" ma:fieldsID="004fb4e21aac4bf94d5df1368d873111" ns3:_="">
     <xsd:import namespace="c76fba90-bd48-4e65-9fce-772627206c4f"/>
@@ -2373,25 +2349,24 @@
 </ct:contentTypeSchema>
 </file>
 
-<file path=customXml/itemProps1.xml><?xml version="1.0" encoding="utf-8"?>
-<ds:datastoreItem xmlns:ds="http://schemas.openxmlformats.org/officeDocument/2006/customXml" ds:itemID="{67B89194-640F-4DC2-878A-AA227FF81D19}">
-  <ds:schemaRefs>
-    <ds:schemaRef ds:uri="http://schemas.microsoft.com/office/2006/metadata/properties"/>
-    <ds:schemaRef ds:uri="http://schemas.microsoft.com/office/infopath/2007/PartnerControls"/>
-    <ds:schemaRef ds:uri="c76fba90-bd48-4e65-9fce-772627206c4f"/>
-  </ds:schemaRefs>
-</ds:datastoreItem>
+<file path=customXml/item2.xml><?xml version="1.0" encoding="utf-8"?>
+<?mso-contentType ?>
+<FormTemplates xmlns="http://schemas.microsoft.com/sharepoint/v3/contenttype/forms">
+  <Display>DocumentLibraryForm</Display>
+  <Edit>DocumentLibraryForm</Edit>
+  <New>DocumentLibraryForm</New>
+</FormTemplates>
 </file>
 
-<file path=customXml/itemProps2.xml><?xml version="1.0" encoding="utf-8"?>
-<ds:datastoreItem xmlns:ds="http://schemas.openxmlformats.org/officeDocument/2006/customXml" ds:itemID="{150D7E1B-4F1F-41DA-94CC-B34696FA2053}">
-  <ds:schemaRefs>
-    <ds:schemaRef ds:uri="http://schemas.microsoft.com/sharepoint/v3/contenttype/forms"/>
-  </ds:schemaRefs>
-</ds:datastoreItem>
+<file path=customXml/item3.xml><?xml version="1.0" encoding="utf-8"?>
+<p:properties xmlns:p="http://schemas.microsoft.com/office/2006/metadata/properties" xmlns:xsi="http://www.w3.org/2001/XMLSchema-instance" xmlns:pc="http://schemas.microsoft.com/office/infopath/2007/PartnerControls">
+  <documentManagement>
+    <_activity xmlns="c76fba90-bd48-4e65-9fce-772627206c4f" xsi:nil="true"/>
+  </documentManagement>
+</p:properties>
 </file>
 
-<file path=customXml/itemProps3.xml><?xml version="1.0" encoding="utf-8"?>
+<file path=customXml/itemProps1.xml><?xml version="1.0" encoding="utf-8"?>
 <ds:datastoreItem xmlns:ds="http://schemas.openxmlformats.org/officeDocument/2006/customXml" ds:itemID="{44B3D7BC-DC27-4E40-9F94-5873E4437891}">
   <ds:schemaRefs>
     <ds:schemaRef ds:uri="http://schemas.microsoft.com/office/2006/metadata/contentType"/>
@@ -2407,4 +2382,22 @@
     <ds:schemaRef ds:uri="http://schemas.microsoft.com/internal/obd"/>
   </ds:schemaRefs>
 </ds:datastoreItem>
+</file>
+
+<file path=customXml/itemProps2.xml><?xml version="1.0" encoding="utf-8"?>
+<ds:datastoreItem xmlns:ds="http://schemas.openxmlformats.org/officeDocument/2006/customXml" ds:itemID="{150D7E1B-4F1F-41DA-94CC-B34696FA2053}">
+  <ds:schemaRefs>
+    <ds:schemaRef ds:uri="http://schemas.microsoft.com/sharepoint/v3/contenttype/forms"/>
+  </ds:schemaRefs>
+</ds:datastoreItem>
+</file>
+
+<file path=customXml/itemProps3.xml><?xml version="1.0" encoding="utf-8"?>
+<ds:datastoreItem xmlns:ds="http://schemas.openxmlformats.org/officeDocument/2006/customXml" ds:itemID="{67B89194-640F-4DC2-878A-AA227FF81D19}">
+  <ds:schemaRefs>
+    <ds:schemaRef ds:uri="http://schemas.microsoft.com/office/2006/metadata/properties"/>
+    <ds:schemaRef ds:uri="http://schemas.microsoft.com/office/infopath/2007/PartnerControls"/>
+    <ds:schemaRef ds:uri="c76fba90-bd48-4e65-9fce-772627206c4f"/>
+  </ds:schemaRefs>
+</ds:datastoreItem>
 </file>
</xml_diff>